<commit_message>
Updated personas and user stories 03/26/2026
</commit_message>
<xml_diff>
--- a/TDD/BravoTeam_TDD.docx
+++ b/TDD/BravoTeam_TDD.docx
@@ -400,6 +400,302 @@
     <w:p>
       <w:pPr>
         <w:numPr>
+          <w:ilvl w:val="1"/>
+          <w:numId w:val="1"/>
+        </w:numPr>
+      </w:pPr>
+      <w:r>
+        <w:t xml:space="preserve">Persona </w:t>
+      </w:r>
+      <w:r>
+        <w:t>2: Returning Guest/Regular</w:t>
+      </w:r>
+    </w:p>
+    <w:p>
+      <w:pPr>
+        <w:numPr>
+          <w:ilvl w:val="2"/>
+          <w:numId w:val="1"/>
+        </w:numPr>
+      </w:pPr>
+      <w:r>
+        <w:t xml:space="preserve">Name: </w:t>
+      </w:r>
+      <w:r>
+        <w:t>Olivia Bennet</w:t>
+      </w:r>
+    </w:p>
+    <w:p>
+      <w:pPr>
+        <w:numPr>
+          <w:ilvl w:val="2"/>
+          <w:numId w:val="1"/>
+        </w:numPr>
+      </w:pPr>
+      <w:r>
+        <w:t>Age:</w:t>
+      </w:r>
+      <w:r>
+        <w:t xml:space="preserve"> 40 </w:t>
+      </w:r>
+      <w:r>
+        <w:t xml:space="preserve"> </w:t>
+      </w:r>
+    </w:p>
+    <w:p>
+      <w:pPr>
+        <w:numPr>
+          <w:ilvl w:val="2"/>
+          <w:numId w:val="1"/>
+        </w:numPr>
+      </w:pPr>
+      <w:r>
+        <w:t xml:space="preserve">Goal: </w:t>
+      </w:r>
+      <w:r>
+        <w:t>Quick bookings without repetitive steps</w:t>
+      </w:r>
+    </w:p>
+    <w:p>
+      <w:pPr>
+        <w:numPr>
+          <w:ilvl w:val="2"/>
+          <w:numId w:val="1"/>
+        </w:numPr>
+      </w:pPr>
+      <w:r>
+        <w:t>Behavior:</w:t>
+      </w:r>
+    </w:p>
+    <w:p>
+      <w:pPr>
+        <w:numPr>
+          <w:ilvl w:val="3"/>
+          <w:numId w:val="1"/>
+        </w:numPr>
+      </w:pPr>
+      <w:r>
+        <w:t>Logs in immediately to access previous reservations</w:t>
+      </w:r>
+    </w:p>
+    <w:p>
+      <w:pPr>
+        <w:numPr>
+          <w:ilvl w:val="3"/>
+          <w:numId w:val="1"/>
+        </w:numPr>
+      </w:pPr>
+      <w:r>
+        <w:t>Prefers expedient checkout and saved preferences</w:t>
+      </w:r>
+    </w:p>
+    <w:p>
+      <w:pPr>
+        <w:numPr>
+          <w:ilvl w:val="2"/>
+          <w:numId w:val="1"/>
+        </w:numPr>
+      </w:pPr>
+      <w:r>
+        <w:t>Needs:</w:t>
+      </w:r>
+    </w:p>
+    <w:p>
+      <w:pPr>
+        <w:numPr>
+          <w:ilvl w:val="3"/>
+          <w:numId w:val="1"/>
+        </w:numPr>
+      </w:pPr>
+      <w:r>
+        <w:t>Saved payment methods</w:t>
+      </w:r>
+    </w:p>
+    <w:p>
+      <w:pPr>
+        <w:numPr>
+          <w:ilvl w:val="3"/>
+          <w:numId w:val="1"/>
+        </w:numPr>
+      </w:pPr>
+      <w:r>
+        <w:t>Easy rebooking options</w:t>
+      </w:r>
+    </w:p>
+    <w:p>
+      <w:pPr>
+        <w:numPr>
+          <w:ilvl w:val="3"/>
+          <w:numId w:val="1"/>
+        </w:numPr>
+      </w:pPr>
+      <w:r>
+        <w:t>Quick access to reservation history</w:t>
+      </w:r>
+    </w:p>
+    <w:p>
+      <w:pPr>
+        <w:pStyle w:val="ListParagraph"/>
+        <w:ind w:left="1440"/>
+      </w:pPr>
+    </w:p>
+    <w:p>
+      <w:pPr>
+        <w:pStyle w:val="ListParagraph"/>
+        <w:ind w:left="2880"/>
+      </w:pPr>
+    </w:p>
+    <w:p>
+      <w:pPr>
+        <w:numPr>
+          <w:ilvl w:val="1"/>
+          <w:numId w:val="1"/>
+        </w:numPr>
+      </w:pPr>
+      <w:r>
+        <w:t>Persona 3:</w:t>
+      </w:r>
+      <w:r>
+        <w:t xml:space="preserve"> </w:t>
+      </w:r>
+      <w:r>
+        <w:t xml:space="preserve">First-Time </w:t>
+      </w:r>
+      <w:r>
+        <w:t>Guest</w:t>
+      </w:r>
+    </w:p>
+    <w:p>
+      <w:pPr>
+        <w:numPr>
+          <w:ilvl w:val="2"/>
+          <w:numId w:val="1"/>
+        </w:numPr>
+      </w:pPr>
+      <w:r>
+        <w:t xml:space="preserve">Name: </w:t>
+      </w:r>
+      <w:r>
+        <w:t>Marcus Lee</w:t>
+      </w:r>
+    </w:p>
+    <w:p>
+      <w:pPr>
+        <w:numPr>
+          <w:ilvl w:val="2"/>
+          <w:numId w:val="1"/>
+        </w:numPr>
+      </w:pPr>
+      <w:r>
+        <w:t xml:space="preserve">Age: </w:t>
+      </w:r>
+      <w:r>
+        <w:t>35</w:t>
+      </w:r>
+    </w:p>
+    <w:p>
+      <w:pPr>
+        <w:numPr>
+          <w:ilvl w:val="2"/>
+          <w:numId w:val="1"/>
+        </w:numPr>
+      </w:pPr>
+      <w:r>
+        <w:t xml:space="preserve">Goal: </w:t>
+      </w:r>
+      <w:r>
+        <w:t>Explore lodging options before committing to a booking</w:t>
+      </w:r>
+    </w:p>
+    <w:p>
+      <w:pPr>
+        <w:numPr>
+          <w:ilvl w:val="2"/>
+          <w:numId w:val="1"/>
+        </w:numPr>
+      </w:pPr>
+      <w:r>
+        <w:t>Behavior:</w:t>
+      </w:r>
+    </w:p>
+    <w:p>
+      <w:pPr>
+        <w:numPr>
+          <w:ilvl w:val="3"/>
+          <w:numId w:val="1"/>
+        </w:numPr>
+      </w:pPr>
+      <w:r>
+        <w:t>Browse multiple pages before registering</w:t>
+      </w:r>
+    </w:p>
+    <w:p>
+      <w:pPr>
+        <w:numPr>
+          <w:ilvl w:val="3"/>
+          <w:numId w:val="1"/>
+        </w:numPr>
+      </w:pPr>
+      <w:r>
+        <w:t>Proactive shopper, compares amenities and costs</w:t>
+      </w:r>
+    </w:p>
+    <w:p>
+      <w:pPr>
+        <w:numPr>
+          <w:ilvl w:val="2"/>
+          <w:numId w:val="1"/>
+        </w:numPr>
+      </w:pPr>
+      <w:r>
+        <w:t>Needs:</w:t>
+      </w:r>
+    </w:p>
+    <w:p>
+      <w:pPr>
+        <w:numPr>
+          <w:ilvl w:val="3"/>
+          <w:numId w:val="1"/>
+        </w:numPr>
+      </w:pPr>
+      <w:r>
+        <w:t>Clear pricing information</w:t>
+      </w:r>
+    </w:p>
+    <w:p>
+      <w:pPr>
+        <w:numPr>
+          <w:ilvl w:val="3"/>
+          <w:numId w:val="1"/>
+        </w:numPr>
+      </w:pPr>
+      <w:r>
+        <w:t>Detailed lodge descriptions</w:t>
+      </w:r>
+    </w:p>
+    <w:p>
+      <w:pPr>
+        <w:numPr>
+          <w:ilvl w:val="3"/>
+          <w:numId w:val="1"/>
+        </w:numPr>
+      </w:pPr>
+      <w:r>
+        <w:t>Intuitive navigation</w:t>
+      </w:r>
+    </w:p>
+    <w:p>
+      <w:pPr>
+        <w:pStyle w:val="ListParagraph"/>
+        <w:numPr>
+          <w:ilvl w:val="0"/>
+          <w:numId w:val="3"/>
+        </w:numPr>
+      </w:pPr>
+    </w:p>
+    <w:p>
+      <w:pPr>
+        <w:numPr>
           <w:ilvl w:val="0"/>
           <w:numId w:val="1"/>
         </w:numPr>
@@ -416,10 +712,10 @@
         <w:tblLook w:val="04A0" w:firstRow="1" w:lastRow="0" w:firstColumn="1" w:lastColumn="0" w:noHBand="0" w:noVBand="1"/>
       </w:tblPr>
       <w:tblGrid>
-        <w:gridCol w:w="1855"/>
-        <w:gridCol w:w="2084"/>
-        <w:gridCol w:w="1987"/>
-        <w:gridCol w:w="1984"/>
+        <w:gridCol w:w="1867"/>
+        <w:gridCol w:w="2066"/>
+        <w:gridCol w:w="1959"/>
+        <w:gridCol w:w="2018"/>
       </w:tblGrid>
       <w:tr>
         <w:tc>
@@ -441,6 +737,7 @@
               <w:t>As a new user, I want to register for an account so that I can make a reservation immediately.</w:t>
             </w:r>
           </w:p>
+          <w:p/>
         </w:tc>
         <w:tc>
           <w:tcPr>
@@ -468,25 +765,42 @@
           <w:tcPr>
             <w:tcW w:w="2337" w:type="dxa"/>
           </w:tcPr>
-          <w:p/>
+          <w:p>
+            <w:r>
+              <w:t>Oliva Bennet</w:t>
+            </w:r>
+          </w:p>
         </w:tc>
         <w:tc>
           <w:tcPr>
             <w:tcW w:w="2337" w:type="dxa"/>
           </w:tcPr>
+          <w:p>
+            <w:r>
+              <w:t>As a returning user, I want to log in quickly so that I can access my previous reservations.</w:t>
+            </w:r>
+          </w:p>
           <w:p/>
         </w:tc>
         <w:tc>
           <w:tcPr>
             <w:tcW w:w="2338" w:type="dxa"/>
           </w:tcPr>
-          <w:p/>
+          <w:p>
+            <w:r>
+              <w:t>As a returning user, I want to rebook a stay easily so that I can save time.</w:t>
+            </w:r>
+          </w:p>
         </w:tc>
         <w:tc>
           <w:tcPr>
             <w:tcW w:w="2338" w:type="dxa"/>
           </w:tcPr>
-          <w:p/>
+          <w:p>
+            <w:r>
+              <w:t>As a user, I want to view my reservation history so that I can manage my bookings.</w:t>
+            </w:r>
+          </w:p>
         </w:tc>
       </w:tr>
       <w:tr>
@@ -494,25 +808,42 @@
           <w:tcPr>
             <w:tcW w:w="2337" w:type="dxa"/>
           </w:tcPr>
-          <w:p/>
+          <w:p>
+            <w:r>
+              <w:t>Marcus Lee</w:t>
+            </w:r>
+          </w:p>
         </w:tc>
         <w:tc>
           <w:tcPr>
             <w:tcW w:w="2337" w:type="dxa"/>
           </w:tcPr>
+          <w:p>
+            <w:r>
+              <w:t>As a new visitor, I want to browse lodge options so that I can decide if I want to stay.</w:t>
+            </w:r>
+          </w:p>
           <w:p/>
         </w:tc>
         <w:tc>
           <w:tcPr>
             <w:tcW w:w="2338" w:type="dxa"/>
           </w:tcPr>
-          <w:p/>
+          <w:p>
+            <w:r>
+              <w:t>As a user, I want to view pricing details so that I can compare options.</w:t>
+            </w:r>
+          </w:p>
         </w:tc>
         <w:tc>
           <w:tcPr>
             <w:tcW w:w="2338" w:type="dxa"/>
           </w:tcPr>
-          <w:p/>
+          <w:p>
+            <w:r>
+              <w:t>As a user, I want easy navigation so that I can find information quickly.</w:t>
+            </w:r>
+          </w:p>
         </w:tc>
       </w:tr>
     </w:tbl>
@@ -639,6 +970,232 @@
 <file path=word/numbering.xml><?xml version="1.0" encoding="utf-8"?>
 <w:numbering xmlns:wpc="http://schemas.microsoft.com/office/word/2010/wordprocessingCanvas" xmlns:cx="http://schemas.microsoft.com/office/drawing/2014/chartex" xmlns:cx1="http://schemas.microsoft.com/office/drawing/2015/9/8/chartex" xmlns:cx2="http://schemas.microsoft.com/office/drawing/2015/10/21/chartex" xmlns:cx3="http://schemas.microsoft.com/office/drawing/2016/5/9/chartex" xmlns:cx4="http://schemas.microsoft.com/office/drawing/2016/5/10/chartex" xmlns:cx5="http://schemas.microsoft.com/office/drawing/2016/5/11/chartex" xmlns:cx6="http://schemas.microsoft.com/office/drawing/2016/5/12/chartex" xmlns:cx7="http://schemas.microsoft.com/office/drawing/2016/5/13/chartex" xmlns:cx8="http://schemas.microsoft.com/office/drawing/2016/5/14/chartex" xmlns:mc="http://schemas.openxmlformats.org/markup-compatibility/2006" xmlns:aink="http://schemas.microsoft.com/office/drawing/2016/ink" xmlns:am3d="http://schemas.microsoft.com/office/drawing/2017/model3d" xmlns:o="urn:schemas-microsoft-com:office:office" xmlns:oel="http://schemas.microsoft.com/office/2019/extlst" xmlns:r="http://schemas.openxmlformats.org/officeDocument/2006/relationships" xmlns:m="http://schemas.openxmlformats.org/officeDocument/2006/math" xmlns:v="urn:schemas-microsoft-com:vml" xmlns:wp14="http://schemas.microsoft.com/office/word/2010/wordprocessingDrawing" xmlns:wp="http://schemas.openxmlformats.org/drawingml/2006/wordprocessingDrawing" xmlns:w10="urn:schemas-microsoft-com:office:word" xmlns:w="http://schemas.openxmlformats.org/wordprocessingml/2006/main" xmlns:w14="http://schemas.microsoft.com/office/word/2010/wordml" xmlns:w15="http://schemas.microsoft.com/office/word/2012/wordml" xmlns:w16cex="http://schemas.microsoft.com/office/word/2018/wordml/cex" xmlns:w16cid="http://schemas.microsoft.com/office/word/2016/wordml/cid" xmlns:w16="http://schemas.microsoft.com/office/word/2018/wordml" xmlns:w16du="http://schemas.microsoft.com/office/word/2023/wordml/word16du" xmlns:w16sdtdh="http://schemas.microsoft.com/office/word/2020/wordml/sdtdatahash" xmlns:w16sdtfl="http://schemas.microsoft.com/office/word/2024/wordml/sdtformatlock" xmlns:w16se="http://schemas.microsoft.com/office/word/2015/wordml/symex" xmlns:wpg="http://schemas.microsoft.com/office/word/2010/wordprocessingGroup" xmlns:wpi="http://schemas.microsoft.com/office/word/2010/wordprocessingInk" xmlns:wne="http://schemas.microsoft.com/office/word/2006/wordml" xmlns:wps="http://schemas.microsoft.com/office/word/2010/wordprocessingShape" mc:Ignorable="w14 w15 w16se w16cid w16 w16cex w16sdtdh w16sdtfl w16du wp14">
   <w:abstractNum w:abstractNumId="0" w15:restartNumberingAfterBreak="0">
+    <w:nsid w:val="23DA1D8A"/>
+    <w:multiLevelType w:val="hybridMultilevel"/>
+    <w:tmpl w:val="9184EA5A"/>
+    <w:lvl w:ilvl="0" w:tplc="04090003">
+      <w:start w:val="1"/>
+      <w:numFmt w:val="bullet"/>
+      <w:lvlText w:val="o"/>
+      <w:lvlJc w:val="left"/>
+      <w:pPr>
+        <w:ind w:left="1440" w:hanging="360"/>
+      </w:pPr>
+      <w:rPr>
+        <w:rFonts w:ascii="Courier New" w:hAnsi="Courier New" w:cs="Courier New" w:hint="default"/>
+      </w:rPr>
+    </w:lvl>
+    <w:lvl w:ilvl="1" w:tplc="04090003" w:tentative="1">
+      <w:start w:val="1"/>
+      <w:numFmt w:val="bullet"/>
+      <w:lvlText w:val="o"/>
+      <w:lvlJc w:val="left"/>
+      <w:pPr>
+        <w:ind w:left="2160" w:hanging="360"/>
+      </w:pPr>
+      <w:rPr>
+        <w:rFonts w:ascii="Courier New" w:hAnsi="Courier New" w:cs="Courier New" w:hint="default"/>
+      </w:rPr>
+    </w:lvl>
+    <w:lvl w:ilvl="2" w:tplc="04090005" w:tentative="1">
+      <w:start w:val="1"/>
+      <w:numFmt w:val="bullet"/>
+      <w:lvlText w:val=""/>
+      <w:lvlJc w:val="left"/>
+      <w:pPr>
+        <w:ind w:left="2880" w:hanging="360"/>
+      </w:pPr>
+      <w:rPr>
+        <w:rFonts w:ascii="Wingdings" w:hAnsi="Wingdings" w:hint="default"/>
+      </w:rPr>
+    </w:lvl>
+    <w:lvl w:ilvl="3" w:tplc="04090001" w:tentative="1">
+      <w:start w:val="1"/>
+      <w:numFmt w:val="bullet"/>
+      <w:lvlText w:val=""/>
+      <w:lvlJc w:val="left"/>
+      <w:pPr>
+        <w:ind w:left="3600" w:hanging="360"/>
+      </w:pPr>
+      <w:rPr>
+        <w:rFonts w:ascii="Symbol" w:hAnsi="Symbol" w:hint="default"/>
+      </w:rPr>
+    </w:lvl>
+    <w:lvl w:ilvl="4" w:tplc="04090003" w:tentative="1">
+      <w:start w:val="1"/>
+      <w:numFmt w:val="bullet"/>
+      <w:lvlText w:val="o"/>
+      <w:lvlJc w:val="left"/>
+      <w:pPr>
+        <w:ind w:left="4320" w:hanging="360"/>
+      </w:pPr>
+      <w:rPr>
+        <w:rFonts w:ascii="Courier New" w:hAnsi="Courier New" w:cs="Courier New" w:hint="default"/>
+      </w:rPr>
+    </w:lvl>
+    <w:lvl w:ilvl="5" w:tplc="04090005" w:tentative="1">
+      <w:start w:val="1"/>
+      <w:numFmt w:val="bullet"/>
+      <w:lvlText w:val=""/>
+      <w:lvlJc w:val="left"/>
+      <w:pPr>
+        <w:ind w:left="5040" w:hanging="360"/>
+      </w:pPr>
+      <w:rPr>
+        <w:rFonts w:ascii="Wingdings" w:hAnsi="Wingdings" w:hint="default"/>
+      </w:rPr>
+    </w:lvl>
+    <w:lvl w:ilvl="6" w:tplc="04090001" w:tentative="1">
+      <w:start w:val="1"/>
+      <w:numFmt w:val="bullet"/>
+      <w:lvlText w:val=""/>
+      <w:lvlJc w:val="left"/>
+      <w:pPr>
+        <w:ind w:left="5760" w:hanging="360"/>
+      </w:pPr>
+      <w:rPr>
+        <w:rFonts w:ascii="Symbol" w:hAnsi="Symbol" w:hint="default"/>
+      </w:rPr>
+    </w:lvl>
+    <w:lvl w:ilvl="7" w:tplc="04090003" w:tentative="1">
+      <w:start w:val="1"/>
+      <w:numFmt w:val="bullet"/>
+      <w:lvlText w:val="o"/>
+      <w:lvlJc w:val="left"/>
+      <w:pPr>
+        <w:ind w:left="6480" w:hanging="360"/>
+      </w:pPr>
+      <w:rPr>
+        <w:rFonts w:ascii="Courier New" w:hAnsi="Courier New" w:cs="Courier New" w:hint="default"/>
+      </w:rPr>
+    </w:lvl>
+    <w:lvl w:ilvl="8" w:tplc="04090005" w:tentative="1">
+      <w:start w:val="1"/>
+      <w:numFmt w:val="bullet"/>
+      <w:lvlText w:val=""/>
+      <w:lvlJc w:val="left"/>
+      <w:pPr>
+        <w:ind w:left="7200" w:hanging="360"/>
+      </w:pPr>
+      <w:rPr>
+        <w:rFonts w:ascii="Wingdings" w:hAnsi="Wingdings" w:hint="default"/>
+      </w:rPr>
+    </w:lvl>
+  </w:abstractNum>
+  <w:abstractNum w:abstractNumId="1" w15:restartNumberingAfterBreak="0">
+    <w:nsid w:val="2D5973FB"/>
+    <w:multiLevelType w:val="hybridMultilevel"/>
+    <w:tmpl w:val="58146E6A"/>
+    <w:lvl w:ilvl="0" w:tplc="04090003">
+      <w:start w:val="1"/>
+      <w:numFmt w:val="bullet"/>
+      <w:lvlText w:val="o"/>
+      <w:lvlJc w:val="left"/>
+      <w:pPr>
+        <w:ind w:left="2160" w:hanging="360"/>
+      </w:pPr>
+      <w:rPr>
+        <w:rFonts w:ascii="Courier New" w:hAnsi="Courier New" w:cs="Courier New" w:hint="default"/>
+      </w:rPr>
+    </w:lvl>
+    <w:lvl w:ilvl="1" w:tplc="04090003" w:tentative="1">
+      <w:start w:val="1"/>
+      <w:numFmt w:val="bullet"/>
+      <w:lvlText w:val="o"/>
+      <w:lvlJc w:val="left"/>
+      <w:pPr>
+        <w:ind w:left="2880" w:hanging="360"/>
+      </w:pPr>
+      <w:rPr>
+        <w:rFonts w:ascii="Courier New" w:hAnsi="Courier New" w:cs="Courier New" w:hint="default"/>
+      </w:rPr>
+    </w:lvl>
+    <w:lvl w:ilvl="2" w:tplc="04090005" w:tentative="1">
+      <w:start w:val="1"/>
+      <w:numFmt w:val="bullet"/>
+      <w:lvlText w:val=""/>
+      <w:lvlJc w:val="left"/>
+      <w:pPr>
+        <w:ind w:left="3600" w:hanging="360"/>
+      </w:pPr>
+      <w:rPr>
+        <w:rFonts w:ascii="Wingdings" w:hAnsi="Wingdings" w:hint="default"/>
+      </w:rPr>
+    </w:lvl>
+    <w:lvl w:ilvl="3" w:tplc="04090001" w:tentative="1">
+      <w:start w:val="1"/>
+      <w:numFmt w:val="bullet"/>
+      <w:lvlText w:val=""/>
+      <w:lvlJc w:val="left"/>
+      <w:pPr>
+        <w:ind w:left="4320" w:hanging="360"/>
+      </w:pPr>
+      <w:rPr>
+        <w:rFonts w:ascii="Symbol" w:hAnsi="Symbol" w:hint="default"/>
+      </w:rPr>
+    </w:lvl>
+    <w:lvl w:ilvl="4" w:tplc="04090003" w:tentative="1">
+      <w:start w:val="1"/>
+      <w:numFmt w:val="bullet"/>
+      <w:lvlText w:val="o"/>
+      <w:lvlJc w:val="left"/>
+      <w:pPr>
+        <w:ind w:left="5040" w:hanging="360"/>
+      </w:pPr>
+      <w:rPr>
+        <w:rFonts w:ascii="Courier New" w:hAnsi="Courier New" w:cs="Courier New" w:hint="default"/>
+      </w:rPr>
+    </w:lvl>
+    <w:lvl w:ilvl="5" w:tplc="04090005" w:tentative="1">
+      <w:start w:val="1"/>
+      <w:numFmt w:val="bullet"/>
+      <w:lvlText w:val=""/>
+      <w:lvlJc w:val="left"/>
+      <w:pPr>
+        <w:ind w:left="5760" w:hanging="360"/>
+      </w:pPr>
+      <w:rPr>
+        <w:rFonts w:ascii="Wingdings" w:hAnsi="Wingdings" w:hint="default"/>
+      </w:rPr>
+    </w:lvl>
+    <w:lvl w:ilvl="6" w:tplc="04090001" w:tentative="1">
+      <w:start w:val="1"/>
+      <w:numFmt w:val="bullet"/>
+      <w:lvlText w:val=""/>
+      <w:lvlJc w:val="left"/>
+      <w:pPr>
+        <w:ind w:left="6480" w:hanging="360"/>
+      </w:pPr>
+      <w:rPr>
+        <w:rFonts w:ascii="Symbol" w:hAnsi="Symbol" w:hint="default"/>
+      </w:rPr>
+    </w:lvl>
+    <w:lvl w:ilvl="7" w:tplc="04090003" w:tentative="1">
+      <w:start w:val="1"/>
+      <w:numFmt w:val="bullet"/>
+      <w:lvlText w:val="o"/>
+      <w:lvlJc w:val="left"/>
+      <w:pPr>
+        <w:ind w:left="7200" w:hanging="360"/>
+      </w:pPr>
+      <w:rPr>
+        <w:rFonts w:ascii="Courier New" w:hAnsi="Courier New" w:cs="Courier New" w:hint="default"/>
+      </w:rPr>
+    </w:lvl>
+    <w:lvl w:ilvl="8" w:tplc="04090005" w:tentative="1">
+      <w:start w:val="1"/>
+      <w:numFmt w:val="bullet"/>
+      <w:lvlText w:val=""/>
+      <w:lvlJc w:val="left"/>
+      <w:pPr>
+        <w:ind w:left="7920" w:hanging="360"/>
+      </w:pPr>
+      <w:rPr>
+        <w:rFonts w:ascii="Wingdings" w:hAnsi="Wingdings" w:hint="default"/>
+      </w:rPr>
+    </w:lvl>
+  </w:abstractNum>
+  <w:abstractNum w:abstractNumId="2" w15:restartNumberingAfterBreak="0">
     <w:nsid w:val="62616DCB"/>
     <w:multiLevelType w:val="multilevel"/>
     <w:tmpl w:val="8556A12E"/>
@@ -788,6 +1345,12 @@
     </w:lvl>
   </w:abstractNum>
   <w:num w:numId="1" w16cid:durableId="120073143">
+    <w:abstractNumId w:val="2"/>
+  </w:num>
+  <w:num w:numId="2" w16cid:durableId="1478643030">
+    <w:abstractNumId w:val="1"/>
+  </w:num>
+  <w:num w:numId="3" w16cid:durableId="1178734169">
     <w:abstractNumId w:val="0"/>
   </w:num>
 </w:numbering>

</xml_diff>

<commit_message>
Added 2 User Personas
</commit_message>
<xml_diff>
--- a/TDD/BravoTeam_TDD.docx
+++ b/TDD/BravoTeam_TDD.docx
@@ -237,15 +237,7 @@
           </w:tcPr>
           <w:p>
             <w:r>
-              <w:t xml:space="preserve">Not logged in </w:t>
-            </w:r>
-            <w:proofErr w:type="gramStart"/>
-            <w:r>
-              <w:t>visitor</w:t>
-            </w:r>
-            <w:proofErr w:type="gramEnd"/>
-            <w:r>
-              <w:t xml:space="preserve"> to the site</w:t>
+              <w:t>Not logged in visitor to the site</w:t>
             </w:r>
           </w:p>
         </w:tc>
@@ -397,6 +389,293 @@
         <w:t>Room with a view</w:t>
       </w:r>
     </w:p>
+    <w:p>
+      <w:pPr>
+        <w:ind w:left="2880"/>
+      </w:pPr>
+    </w:p>
+    <w:p>
+      <w:pPr>
+        <w:numPr>
+          <w:ilvl w:val="2"/>
+          <w:numId w:val="1"/>
+        </w:numPr>
+      </w:pPr>
+      <w:r>
+        <w:t xml:space="preserve">Persona </w:t>
+      </w:r>
+      <w:r>
+        <w:t>2</w:t>
+      </w:r>
+      <w:r>
+        <w:t xml:space="preserve">: </w:t>
+      </w:r>
+      <w:r>
+        <w:t>College Student Traveler</w:t>
+      </w:r>
+    </w:p>
+    <w:p>
+      <w:pPr>
+        <w:numPr>
+          <w:ilvl w:val="2"/>
+          <w:numId w:val="1"/>
+        </w:numPr>
+      </w:pPr>
+      <w:r>
+        <w:t xml:space="preserve">Name: </w:t>
+      </w:r>
+      <w:r>
+        <w:t>Jordan Miller</w:t>
+      </w:r>
+    </w:p>
+    <w:p>
+      <w:pPr>
+        <w:numPr>
+          <w:ilvl w:val="2"/>
+          <w:numId w:val="1"/>
+        </w:numPr>
+      </w:pPr>
+      <w:r>
+        <w:t>Age: 2</w:t>
+      </w:r>
+      <w:r>
+        <w:t>2</w:t>
+      </w:r>
+    </w:p>
+    <w:p>
+      <w:pPr>
+        <w:numPr>
+          <w:ilvl w:val="2"/>
+          <w:numId w:val="1"/>
+        </w:numPr>
+      </w:pPr>
+      <w:r>
+        <w:t>Goal: Save money while booking a quick and easy stay</w:t>
+      </w:r>
+    </w:p>
+    <w:p>
+      <w:pPr>
+        <w:numPr>
+          <w:ilvl w:val="2"/>
+          <w:numId w:val="1"/>
+        </w:numPr>
+      </w:pPr>
+      <w:r>
+        <w:t>Behavior:</w:t>
+      </w:r>
+    </w:p>
+    <w:p>
+      <w:pPr>
+        <w:numPr>
+          <w:ilvl w:val="3"/>
+          <w:numId w:val="1"/>
+        </w:numPr>
+      </w:pPr>
+      <w:r>
+        <w:t>Compares prices before booking</w:t>
+      </w:r>
+    </w:p>
+    <w:p>
+      <w:pPr>
+        <w:numPr>
+          <w:ilvl w:val="3"/>
+          <w:numId w:val="1"/>
+        </w:numPr>
+      </w:pPr>
+      <w:r>
+        <w:t>Prefers a fast and easy reservation process</w:t>
+      </w:r>
+    </w:p>
+    <w:p>
+      <w:pPr>
+        <w:numPr>
+          <w:ilvl w:val="2"/>
+          <w:numId w:val="1"/>
+        </w:numPr>
+      </w:pPr>
+      <w:r>
+        <w:t>Needs:</w:t>
+      </w:r>
+    </w:p>
+    <w:p>
+      <w:pPr>
+        <w:numPr>
+          <w:ilvl w:val="3"/>
+          <w:numId w:val="1"/>
+        </w:numPr>
+      </w:pPr>
+      <w:r>
+        <w:t>Clear and transparent pricing</w:t>
+      </w:r>
+    </w:p>
+    <w:p>
+      <w:pPr>
+        <w:numPr>
+          <w:ilvl w:val="3"/>
+          <w:numId w:val="1"/>
+        </w:numPr>
+      </w:pPr>
+      <w:r>
+        <w:t xml:space="preserve">Fast login </w:t>
+      </w:r>
+      <w:proofErr w:type="spellStart"/>
+      <w:r>
+        <w:t>system</w:t>
+      </w:r>
+    </w:p>
+    <w:p>
+      <w:pPr>
+        <w:numPr>
+          <w:ilvl w:val="3"/>
+          <w:numId w:val="1"/>
+        </w:numPr>
+      </w:pPr>
+      <w:proofErr w:type="spellEnd"/>
+      <w:r>
+        <w:t>Simple booking process</w:t>
+      </w:r>
+    </w:p>
+    <w:p>
+      <w:pPr>
+        <w:ind w:left="2160"/>
+      </w:pPr>
+    </w:p>
+    <w:p>
+      <w:pPr>
+        <w:numPr>
+          <w:ilvl w:val="2"/>
+          <w:numId w:val="1"/>
+        </w:numPr>
+      </w:pPr>
+      <w:r>
+        <w:t xml:space="preserve">Persona </w:t>
+      </w:r>
+      <w:r>
+        <w:t>3</w:t>
+      </w:r>
+      <w:r>
+        <w:t>: Vacationing Couple</w:t>
+      </w:r>
+    </w:p>
+    <w:p>
+      <w:pPr>
+        <w:numPr>
+          <w:ilvl w:val="2"/>
+          <w:numId w:val="1"/>
+        </w:numPr>
+      </w:pPr>
+      <w:r>
+        <w:t>Name: Emily Davis</w:t>
+      </w:r>
+    </w:p>
+    <w:p>
+      <w:pPr>
+        <w:numPr>
+          <w:ilvl w:val="2"/>
+          <w:numId w:val="1"/>
+        </w:numPr>
+      </w:pPr>
+      <w:r>
+        <w:t xml:space="preserve">Age: </w:t>
+      </w:r>
+      <w:r>
+        <w:t>30</w:t>
+      </w:r>
+    </w:p>
+    <w:p>
+      <w:pPr>
+        <w:numPr>
+          <w:ilvl w:val="2"/>
+          <w:numId w:val="1"/>
+        </w:numPr>
+      </w:pPr>
+      <w:r>
+        <w:t>Goal: Relax and enjoy a well-planned vacation</w:t>
+      </w:r>
+    </w:p>
+    <w:p>
+      <w:pPr>
+        <w:numPr>
+          <w:ilvl w:val="2"/>
+          <w:numId w:val="1"/>
+        </w:numPr>
+      </w:pPr>
+      <w:r>
+        <w:t>Behavior:</w:t>
+      </w:r>
+    </w:p>
+    <w:p>
+      <w:pPr>
+        <w:numPr>
+          <w:ilvl w:val="3"/>
+          <w:numId w:val="1"/>
+        </w:numPr>
+      </w:pPr>
+      <w:r>
+        <w:t>Plans everything ahead of time</w:t>
+      </w:r>
+    </w:p>
+    <w:p>
+      <w:pPr>
+        <w:numPr>
+          <w:ilvl w:val="3"/>
+          <w:numId w:val="1"/>
+        </w:numPr>
+      </w:pPr>
+      <w:r>
+        <w:t>Takes time choosing the best room option</w:t>
+      </w:r>
+    </w:p>
+    <w:p>
+      <w:pPr>
+        <w:numPr>
+          <w:ilvl w:val="2"/>
+          <w:numId w:val="1"/>
+        </w:numPr>
+      </w:pPr>
+      <w:r>
+        <w:t>Needs:</w:t>
+      </w:r>
+    </w:p>
+    <w:p>
+      <w:pPr>
+        <w:numPr>
+          <w:ilvl w:val="3"/>
+          <w:numId w:val="1"/>
+        </w:numPr>
+      </w:pPr>
+      <w:r>
+        <w:t>Variety of room options</w:t>
+      </w:r>
+    </w:p>
+    <w:p>
+      <w:pPr>
+        <w:numPr>
+          <w:ilvl w:val="3"/>
+          <w:numId w:val="1"/>
+        </w:numPr>
+      </w:pPr>
+      <w:r>
+        <w:t xml:space="preserve">Detailed amenities </w:t>
+      </w:r>
+      <w:proofErr w:type="spellStart"/>
+      <w:r>
+        <w:t>information</w:t>
+      </w:r>
+    </w:p>
+    <w:p>
+      <w:pPr>
+        <w:numPr>
+          <w:ilvl w:val="3"/>
+          <w:numId w:val="1"/>
+        </w:numPr>
+      </w:pPr>
+      <w:proofErr w:type="spellEnd"/>
+      <w:r>
+        <w:t>Easy reservation planning</w:t>
+      </w:r>
+    </w:p>
+    <w:p/>
     <w:p>
       <w:pPr>
         <w:numPr>
@@ -610,15 +889,7 @@
       <w:jc w:val="right"/>
     </w:pPr>
     <w:r>
-      <w:t xml:space="preserve">Zachary Anderson, Angela Vargas, </w:t>
-    </w:r>
-    <w:proofErr w:type="spellStart"/>
-    <w:r>
-      <w:t>Tevyah</w:t>
-    </w:r>
-    <w:proofErr w:type="spellEnd"/>
-    <w:r>
-      <w:t xml:space="preserve"> Hanley, Cameron</w:t>
+      <w:t>Zachary Anderson, Angela Vargas, Tevyah Hanley, Cameron</w:t>
     </w:r>
     <w:r>
       <w:t xml:space="preserve"> Mendez</w:t>
@@ -1396,6 +1667,7 @@
   <w:style w:type="character" w:default="1" w:styleId="DefaultParagraphFont">
     <w:name w:val="Default Paragraph Font"/>
     <w:uiPriority w:val="1"/>
+    <w:semiHidden/>
     <w:unhideWhenUsed/>
   </w:style>
   <w:style w:type="table" w:default="1" w:styleId="TableNormal">

</xml_diff>

<commit_message>
Pushing TDD changes -Anderson 3/27/26
</commit_message>
<xml_diff>
--- a/TDD/BravoTeam_TDD.docx
+++ b/TDD/BravoTeam_TDD.docx
@@ -22,10 +22,7 @@
         </w:numPr>
       </w:pPr>
       <w:r>
-        <w:t>Introduction</w:t>
-      </w:r>
-      <w:r>
-        <w:t xml:space="preserve"> </w:t>
+        <w:t xml:space="preserve">Introduction </w:t>
       </w:r>
     </w:p>
     <w:p>
@@ -65,7 +62,7 @@
     <w:p>
       <w:pPr>
         <w:numPr>
-          <w:ilvl w:val="0"/>
+          <w:ilvl w:val="1"/>
           <w:numId w:val="1"/>
         </w:numPr>
       </w:pPr>
@@ -76,7 +73,7 @@
     <w:p>
       <w:pPr>
         <w:numPr>
-          <w:ilvl w:val="1"/>
+          <w:ilvl w:val="2"/>
           <w:numId w:val="1"/>
         </w:numPr>
       </w:pPr>
@@ -247,7 +244,7 @@
     <w:p>
       <w:pPr>
         <w:numPr>
-          <w:ilvl w:val="0"/>
+          <w:ilvl w:val="1"/>
           <w:numId w:val="1"/>
         </w:numPr>
       </w:pPr>
@@ -258,7 +255,7 @@
     <w:p>
       <w:pPr>
         <w:numPr>
-          <w:ilvl w:val="1"/>
+          <w:ilvl w:val="2"/>
           <w:numId w:val="1"/>
         </w:numPr>
       </w:pPr>
@@ -269,7 +266,7 @@
     <w:p>
       <w:pPr>
         <w:numPr>
-          <w:ilvl w:val="2"/>
+          <w:ilvl w:val="3"/>
           <w:numId w:val="1"/>
         </w:numPr>
       </w:pPr>
@@ -280,7 +277,7 @@
     <w:p>
       <w:pPr>
         <w:numPr>
-          <w:ilvl w:val="2"/>
+          <w:ilvl w:val="3"/>
           <w:numId w:val="1"/>
         </w:numPr>
       </w:pPr>
@@ -291,7 +288,7 @@
     <w:p>
       <w:pPr>
         <w:numPr>
-          <w:ilvl w:val="2"/>
+          <w:ilvl w:val="3"/>
           <w:numId w:val="1"/>
         </w:numPr>
       </w:pPr>
@@ -302,7 +299,7 @@
     <w:p>
       <w:pPr>
         <w:numPr>
-          <w:ilvl w:val="2"/>
+          <w:ilvl w:val="3"/>
           <w:numId w:val="1"/>
         </w:numPr>
       </w:pPr>
@@ -313,52 +310,52 @@
     <w:p>
       <w:pPr>
         <w:numPr>
+          <w:ilvl w:val="4"/>
+          <w:numId w:val="1"/>
+        </w:numPr>
+      </w:pPr>
+      <w:r>
+        <w:t>Register</w:t>
+      </w:r>
+      <w:r>
+        <w:t xml:space="preserve"> immediately, hoping for deals</w:t>
+      </w:r>
+    </w:p>
+    <w:p>
+      <w:pPr>
+        <w:numPr>
+          <w:ilvl w:val="4"/>
+          <w:numId w:val="1"/>
+        </w:numPr>
+      </w:pPr>
+      <w:r>
+        <w:t>Look</w:t>
+      </w:r>
+      <w:r>
+        <w:t xml:space="preserve"> into </w:t>
+      </w:r>
+      <w:r>
+        <w:t xml:space="preserve">the </w:t>
+      </w:r>
+      <w:r>
+        <w:t>amenities offered at the lodge</w:t>
+      </w:r>
+    </w:p>
+    <w:p>
+      <w:pPr>
+        <w:numPr>
           <w:ilvl w:val="3"/>
           <w:numId w:val="1"/>
         </w:numPr>
       </w:pPr>
       <w:r>
-        <w:t>Register</w:t>
-      </w:r>
-      <w:r>
-        <w:t xml:space="preserve"> immediately, hoping for deals</w:t>
-      </w:r>
-    </w:p>
-    <w:p>
-      <w:pPr>
-        <w:numPr>
-          <w:ilvl w:val="3"/>
-          <w:numId w:val="1"/>
-        </w:numPr>
-      </w:pPr>
-      <w:r>
-        <w:t>Look</w:t>
-      </w:r>
-      <w:r>
-        <w:t xml:space="preserve"> into </w:t>
-      </w:r>
-      <w:r>
-        <w:t xml:space="preserve">the </w:t>
-      </w:r>
-      <w:r>
-        <w:t>amenities offered at the lodge</w:t>
-      </w:r>
-    </w:p>
-    <w:p>
-      <w:pPr>
-        <w:numPr>
-          <w:ilvl w:val="2"/>
-          <w:numId w:val="1"/>
-        </w:numPr>
-      </w:pPr>
-      <w:r>
         <w:t>Needs:</w:t>
       </w:r>
     </w:p>
     <w:p>
       <w:pPr>
         <w:numPr>
-          <w:ilvl w:val="3"/>
+          <w:ilvl w:val="4"/>
           <w:numId w:val="1"/>
         </w:numPr>
       </w:pPr>
@@ -369,7 +366,7 @@
     <w:p>
       <w:pPr>
         <w:numPr>
-          <w:ilvl w:val="3"/>
+          <w:ilvl w:val="4"/>
           <w:numId w:val="1"/>
         </w:numPr>
       </w:pPr>
@@ -381,17 +378,143 @@
     <w:p>
       <w:pPr>
         <w:numPr>
+          <w:ilvl w:val="4"/>
+          <w:numId w:val="1"/>
+        </w:numPr>
+      </w:pPr>
+      <w:r>
+        <w:t>Room with a view</w:t>
+      </w:r>
+    </w:p>
+    <w:p>
+      <w:pPr>
+        <w:ind w:left="2880"/>
+      </w:pPr>
+    </w:p>
+    <w:p>
+      <w:pPr>
+        <w:numPr>
+          <w:ilvl w:val="2"/>
+          <w:numId w:val="1"/>
+        </w:numPr>
+      </w:pPr>
+      <w:r>
+        <w:t>Persona 2: College Student Traveler</w:t>
+      </w:r>
+    </w:p>
+    <w:p>
+      <w:pPr>
+        <w:numPr>
           <w:ilvl w:val="3"/>
           <w:numId w:val="1"/>
         </w:numPr>
       </w:pPr>
       <w:r>
-        <w:t>Room with a view</w:t>
-      </w:r>
-    </w:p>
-    <w:p>
-      <w:pPr>
-        <w:ind w:left="2880"/>
+        <w:t>Name: Jordan Miller</w:t>
+      </w:r>
+    </w:p>
+    <w:p>
+      <w:pPr>
+        <w:numPr>
+          <w:ilvl w:val="3"/>
+          <w:numId w:val="1"/>
+        </w:numPr>
+      </w:pPr>
+      <w:r>
+        <w:t>Age: 22</w:t>
+      </w:r>
+    </w:p>
+    <w:p>
+      <w:pPr>
+        <w:numPr>
+          <w:ilvl w:val="3"/>
+          <w:numId w:val="1"/>
+        </w:numPr>
+      </w:pPr>
+      <w:r>
+        <w:t>Goal: Save money while booking a quick and easy stay</w:t>
+      </w:r>
+    </w:p>
+    <w:p>
+      <w:pPr>
+        <w:numPr>
+          <w:ilvl w:val="3"/>
+          <w:numId w:val="1"/>
+        </w:numPr>
+      </w:pPr>
+      <w:r>
+        <w:t>Behavior:</w:t>
+      </w:r>
+    </w:p>
+    <w:p>
+      <w:pPr>
+        <w:numPr>
+          <w:ilvl w:val="4"/>
+          <w:numId w:val="1"/>
+        </w:numPr>
+      </w:pPr>
+      <w:r>
+        <w:t>Compares prices before booking</w:t>
+      </w:r>
+    </w:p>
+    <w:p>
+      <w:pPr>
+        <w:numPr>
+          <w:ilvl w:val="4"/>
+          <w:numId w:val="1"/>
+        </w:numPr>
+      </w:pPr>
+      <w:r>
+        <w:t>Prefers a fast and easy reservation process</w:t>
+      </w:r>
+    </w:p>
+    <w:p>
+      <w:pPr>
+        <w:numPr>
+          <w:ilvl w:val="3"/>
+          <w:numId w:val="1"/>
+        </w:numPr>
+      </w:pPr>
+      <w:r>
+        <w:t>Needs:</w:t>
+      </w:r>
+    </w:p>
+    <w:p>
+      <w:pPr>
+        <w:numPr>
+          <w:ilvl w:val="4"/>
+          <w:numId w:val="1"/>
+        </w:numPr>
+      </w:pPr>
+      <w:r>
+        <w:t>Clear and transparent pricing</w:t>
+      </w:r>
+    </w:p>
+    <w:p>
+      <w:pPr>
+        <w:numPr>
+          <w:ilvl w:val="4"/>
+          <w:numId w:val="1"/>
+        </w:numPr>
+      </w:pPr>
+      <w:r>
+        <w:t>Fast login system</w:t>
+      </w:r>
+    </w:p>
+    <w:p>
+      <w:pPr>
+        <w:numPr>
+          <w:ilvl w:val="4"/>
+          <w:numId w:val="1"/>
+        </w:numPr>
+      </w:pPr>
+      <w:r>
+        <w:t>Simple booking process</w:t>
+      </w:r>
+    </w:p>
+    <w:p>
+      <w:pPr>
+        <w:ind w:left="2160"/>
       </w:pPr>
     </w:p>
     <w:p>
@@ -402,61 +525,46 @@
         </w:numPr>
       </w:pPr>
       <w:r>
-        <w:t xml:space="preserve">Persona </w:t>
-      </w:r>
-      <w:r>
-        <w:t>2</w:t>
-      </w:r>
-      <w:r>
-        <w:t xml:space="preserve">: </w:t>
-      </w:r>
-      <w:r>
-        <w:t>College Student Traveler</w:t>
-      </w:r>
-    </w:p>
-    <w:p>
-      <w:pPr>
-        <w:numPr>
-          <w:ilvl w:val="2"/>
-          <w:numId w:val="1"/>
-        </w:numPr>
-      </w:pPr>
-      <w:r>
-        <w:t xml:space="preserve">Name: </w:t>
-      </w:r>
-      <w:r>
-        <w:t>Jordan Miller</w:t>
-      </w:r>
-    </w:p>
-    <w:p>
-      <w:pPr>
-        <w:numPr>
-          <w:ilvl w:val="2"/>
-          <w:numId w:val="1"/>
-        </w:numPr>
-      </w:pPr>
-      <w:r>
-        <w:t>Age: 2</w:t>
-      </w:r>
-      <w:r>
-        <w:t>2</w:t>
-      </w:r>
-    </w:p>
-    <w:p>
-      <w:pPr>
-        <w:numPr>
-          <w:ilvl w:val="2"/>
-          <w:numId w:val="1"/>
-        </w:numPr>
-      </w:pPr>
-      <w:r>
-        <w:t>Goal: Save money while booking a quick and easy stay</w:t>
-      </w:r>
-    </w:p>
-    <w:p>
-      <w:pPr>
-        <w:numPr>
-          <w:ilvl w:val="2"/>
+        <w:t>Persona 3: Vacationing Couple</w:t>
+      </w:r>
+    </w:p>
+    <w:p>
+      <w:pPr>
+        <w:numPr>
+          <w:ilvl w:val="3"/>
+          <w:numId w:val="1"/>
+        </w:numPr>
+      </w:pPr>
+      <w:r>
+        <w:t>Name: Emily Davis</w:t>
+      </w:r>
+    </w:p>
+    <w:p>
+      <w:pPr>
+        <w:numPr>
+          <w:ilvl w:val="3"/>
+          <w:numId w:val="1"/>
+        </w:numPr>
+      </w:pPr>
+      <w:r>
+        <w:t>Age: 30</w:t>
+      </w:r>
+    </w:p>
+    <w:p>
+      <w:pPr>
+        <w:numPr>
+          <w:ilvl w:val="3"/>
+          <w:numId w:val="1"/>
+        </w:numPr>
+      </w:pPr>
+      <w:r>
+        <w:t>Goal: Relax and enjoy a well-planned vacation</w:t>
+      </w:r>
+    </w:p>
+    <w:p>
+      <w:pPr>
+        <w:numPr>
+          <w:ilvl w:val="3"/>
           <w:numId w:val="1"/>
         </w:numPr>
       </w:pPr>
@@ -467,180 +575,40 @@
     <w:p>
       <w:pPr>
         <w:numPr>
+          <w:ilvl w:val="4"/>
+          <w:numId w:val="1"/>
+        </w:numPr>
+      </w:pPr>
+      <w:r>
+        <w:t>Plans everything ahead of time</w:t>
+      </w:r>
+    </w:p>
+    <w:p>
+      <w:pPr>
+        <w:numPr>
+          <w:ilvl w:val="4"/>
+          <w:numId w:val="1"/>
+        </w:numPr>
+      </w:pPr>
+      <w:r>
+        <w:t>Takes time choosing the best room option</w:t>
+      </w:r>
+    </w:p>
+    <w:p>
+      <w:pPr>
+        <w:numPr>
           <w:ilvl w:val="3"/>
           <w:numId w:val="1"/>
         </w:numPr>
       </w:pPr>
       <w:r>
-        <w:t>Compares prices before booking</w:t>
-      </w:r>
-    </w:p>
-    <w:p>
-      <w:pPr>
-        <w:numPr>
-          <w:ilvl w:val="3"/>
-          <w:numId w:val="1"/>
-        </w:numPr>
-      </w:pPr>
-      <w:r>
-        <w:t>Prefers a fast and easy reservation process</w:t>
-      </w:r>
-    </w:p>
-    <w:p>
-      <w:pPr>
-        <w:numPr>
-          <w:ilvl w:val="2"/>
-          <w:numId w:val="1"/>
-        </w:numPr>
-      </w:pPr>
-      <w:r>
         <w:t>Needs:</w:t>
       </w:r>
     </w:p>
     <w:p>
       <w:pPr>
         <w:numPr>
-          <w:ilvl w:val="3"/>
-          <w:numId w:val="1"/>
-        </w:numPr>
-      </w:pPr>
-      <w:r>
-        <w:t>Clear and transparent pricing</w:t>
-      </w:r>
-    </w:p>
-    <w:p>
-      <w:pPr>
-        <w:numPr>
-          <w:ilvl w:val="3"/>
-          <w:numId w:val="1"/>
-        </w:numPr>
-      </w:pPr>
-      <w:r>
-        <w:t xml:space="preserve">Fast login </w:t>
-      </w:r>
-      <w:proofErr w:type="spellStart"/>
-      <w:r>
-        <w:t>system</w:t>
-      </w:r>
-    </w:p>
-    <w:p>
-      <w:pPr>
-        <w:numPr>
-          <w:ilvl w:val="3"/>
-          <w:numId w:val="1"/>
-        </w:numPr>
-      </w:pPr>
-      <w:proofErr w:type="spellEnd"/>
-      <w:r>
-        <w:t>Simple booking process</w:t>
-      </w:r>
-    </w:p>
-    <w:p>
-      <w:pPr>
-        <w:ind w:left="2160"/>
-      </w:pPr>
-    </w:p>
-    <w:p>
-      <w:pPr>
-        <w:numPr>
-          <w:ilvl w:val="2"/>
-          <w:numId w:val="1"/>
-        </w:numPr>
-      </w:pPr>
-      <w:r>
-        <w:t xml:space="preserve">Persona </w:t>
-      </w:r>
-      <w:r>
-        <w:t>3</w:t>
-      </w:r>
-      <w:r>
-        <w:t>: Vacationing Couple</w:t>
-      </w:r>
-    </w:p>
-    <w:p>
-      <w:pPr>
-        <w:numPr>
-          <w:ilvl w:val="2"/>
-          <w:numId w:val="1"/>
-        </w:numPr>
-      </w:pPr>
-      <w:r>
-        <w:t>Name: Emily Davis</w:t>
-      </w:r>
-    </w:p>
-    <w:p>
-      <w:pPr>
-        <w:numPr>
-          <w:ilvl w:val="2"/>
-          <w:numId w:val="1"/>
-        </w:numPr>
-      </w:pPr>
-      <w:r>
-        <w:t xml:space="preserve">Age: </w:t>
-      </w:r>
-      <w:r>
-        <w:t>30</w:t>
-      </w:r>
-    </w:p>
-    <w:p>
-      <w:pPr>
-        <w:numPr>
-          <w:ilvl w:val="2"/>
-          <w:numId w:val="1"/>
-        </w:numPr>
-      </w:pPr>
-      <w:r>
-        <w:t>Goal: Relax and enjoy a well-planned vacation</w:t>
-      </w:r>
-    </w:p>
-    <w:p>
-      <w:pPr>
-        <w:numPr>
-          <w:ilvl w:val="2"/>
-          <w:numId w:val="1"/>
-        </w:numPr>
-      </w:pPr>
-      <w:r>
-        <w:t>Behavior:</w:t>
-      </w:r>
-    </w:p>
-    <w:p>
-      <w:pPr>
-        <w:numPr>
-          <w:ilvl w:val="3"/>
-          <w:numId w:val="1"/>
-        </w:numPr>
-      </w:pPr>
-      <w:r>
-        <w:t>Plans everything ahead of time</w:t>
-      </w:r>
-    </w:p>
-    <w:p>
-      <w:pPr>
-        <w:numPr>
-          <w:ilvl w:val="3"/>
-          <w:numId w:val="1"/>
-        </w:numPr>
-      </w:pPr>
-      <w:r>
-        <w:t>Takes time choosing the best room option</w:t>
-      </w:r>
-    </w:p>
-    <w:p>
-      <w:pPr>
-        <w:numPr>
-          <w:ilvl w:val="2"/>
-          <w:numId w:val="1"/>
-        </w:numPr>
-      </w:pPr>
-      <w:r>
-        <w:t>Needs:</w:t>
-      </w:r>
-    </w:p>
-    <w:p>
-      <w:pPr>
-        <w:numPr>
-          <w:ilvl w:val="3"/>
+          <w:ilvl w:val="4"/>
           <w:numId w:val="1"/>
         </w:numPr>
       </w:pPr>
@@ -651,26 +619,21 @@
     <w:p>
       <w:pPr>
         <w:numPr>
-          <w:ilvl w:val="3"/>
-          <w:numId w:val="1"/>
-        </w:numPr>
-      </w:pPr>
-      <w:r>
-        <w:t xml:space="preserve">Detailed amenities </w:t>
-      </w:r>
-      <w:proofErr w:type="spellStart"/>
-      <w:r>
-        <w:t>information</w:t>
-      </w:r>
-    </w:p>
-    <w:p>
-      <w:pPr>
-        <w:numPr>
-          <w:ilvl w:val="3"/>
-          <w:numId w:val="1"/>
-        </w:numPr>
-      </w:pPr>
-      <w:proofErr w:type="spellEnd"/>
+          <w:ilvl w:val="4"/>
+          <w:numId w:val="1"/>
+        </w:numPr>
+      </w:pPr>
+      <w:r>
+        <w:t>Detailed amenities information</w:t>
+      </w:r>
+    </w:p>
+    <w:p>
+      <w:pPr>
+        <w:numPr>
+          <w:ilvl w:val="4"/>
+          <w:numId w:val="1"/>
+        </w:numPr>
+      </w:pPr>
       <w:r>
         <w:t>Easy reservation planning</w:t>
       </w:r>
@@ -679,7 +642,7 @@
     <w:p>
       <w:pPr>
         <w:numPr>
-          <w:ilvl w:val="0"/>
+          <w:ilvl w:val="1"/>
           <w:numId w:val="1"/>
         </w:numPr>
       </w:pPr>
@@ -695,10 +658,10 @@
         <w:tblLook w:val="04A0" w:firstRow="1" w:lastRow="0" w:firstColumn="1" w:lastColumn="0" w:noHBand="0" w:noVBand="1"/>
       </w:tblPr>
       <w:tblGrid>
-        <w:gridCol w:w="1855"/>
-        <w:gridCol w:w="2084"/>
-        <w:gridCol w:w="1987"/>
-        <w:gridCol w:w="1984"/>
+        <w:gridCol w:w="1868"/>
+        <w:gridCol w:w="2080"/>
+        <w:gridCol w:w="1982"/>
+        <w:gridCol w:w="1980"/>
       </w:tblGrid>
       <w:tr>
         <w:tc>
@@ -747,7 +710,11 @@
           <w:tcPr>
             <w:tcW w:w="2337" w:type="dxa"/>
           </w:tcPr>
-          <w:p/>
+          <w:p>
+            <w:r>
+              <w:t>Jordan Miller</w:t>
+            </w:r>
+          </w:p>
         </w:tc>
         <w:tc>
           <w:tcPr>
@@ -773,7 +740,11 @@
           <w:tcPr>
             <w:tcW w:w="2337" w:type="dxa"/>
           </w:tcPr>
-          <w:p/>
+          <w:p>
+            <w:r>
+              <w:t>Emily Davis</w:t>
+            </w:r>
+          </w:p>
         </w:tc>
         <w:tc>
           <w:tcPr>
@@ -803,21 +774,570 @@
     <w:p>
       <w:pPr>
         <w:numPr>
+          <w:ilvl w:val="1"/>
+          <w:numId w:val="1"/>
+        </w:numPr>
+      </w:pPr>
+      <w:r>
+        <w:t>1.5 Work Estimations (ToDo List)</w:t>
+      </w:r>
+    </w:p>
+    <w:p>
+      <w:pPr>
+        <w:numPr>
+          <w:ilvl w:val="2"/>
+          <w:numId w:val="1"/>
+        </w:numPr>
+      </w:pPr>
+      <w:r>
+        <w:t>Story 1:</w:t>
+      </w:r>
+    </w:p>
+    <w:tbl>
+      <w:tblPr>
+        <w:tblStyle w:val="TableGrid"/>
+        <w:tblW w:w="0" w:type="auto"/>
+        <w:tblInd w:w="2160" w:type="dxa"/>
+        <w:tblLook w:val="04A0" w:firstRow="1" w:lastRow="0" w:firstColumn="1" w:lastColumn="0" w:noHBand="0" w:noVBand="1"/>
+      </w:tblPr>
+      <w:tblGrid>
+        <w:gridCol w:w="2303"/>
+        <w:gridCol w:w="2564"/>
+        <w:gridCol w:w="2323"/>
+      </w:tblGrid>
+      <w:tr>
+        <w:tc>
+          <w:tcPr>
+            <w:tcW w:w="3116" w:type="dxa"/>
+          </w:tcPr>
+          <w:p>
+            <w:r>
+              <w:t>Tasks</w:t>
+            </w:r>
+          </w:p>
+        </w:tc>
+        <w:tc>
+          <w:tcPr>
+            <w:tcW w:w="3117" w:type="dxa"/>
+          </w:tcPr>
+          <w:p>
+            <w:r>
+              <w:t>Descriptions</w:t>
+            </w:r>
+          </w:p>
+        </w:tc>
+        <w:tc>
+          <w:tcPr>
+            <w:tcW w:w="3117" w:type="dxa"/>
+          </w:tcPr>
+          <w:p>
+            <w:r>
+              <w:t>Hours</w:t>
+            </w:r>
+          </w:p>
+        </w:tc>
+      </w:tr>
+      <w:tr>
+        <w:tc>
+          <w:tcPr>
+            <w:tcW w:w="3116" w:type="dxa"/>
+          </w:tcPr>
+          <w:p/>
+        </w:tc>
+        <w:tc>
+          <w:tcPr>
+            <w:tcW w:w="3117" w:type="dxa"/>
+          </w:tcPr>
+          <w:p/>
+        </w:tc>
+        <w:tc>
+          <w:tcPr>
+            <w:tcW w:w="3117" w:type="dxa"/>
+          </w:tcPr>
+          <w:p/>
+        </w:tc>
+      </w:tr>
+      <w:tr>
+        <w:tc>
+          <w:tcPr>
+            <w:tcW w:w="3116" w:type="dxa"/>
+          </w:tcPr>
+          <w:p/>
+        </w:tc>
+        <w:tc>
+          <w:tcPr>
+            <w:tcW w:w="3117" w:type="dxa"/>
+          </w:tcPr>
+          <w:p/>
+        </w:tc>
+        <w:tc>
+          <w:tcPr>
+            <w:tcW w:w="3117" w:type="dxa"/>
+          </w:tcPr>
+          <w:p/>
+        </w:tc>
+      </w:tr>
+      <w:tr>
+        <w:tc>
+          <w:tcPr>
+            <w:tcW w:w="3116" w:type="dxa"/>
+          </w:tcPr>
+          <w:p/>
+        </w:tc>
+        <w:tc>
+          <w:tcPr>
+            <w:tcW w:w="3117" w:type="dxa"/>
+          </w:tcPr>
+          <w:p/>
+        </w:tc>
+        <w:tc>
+          <w:tcPr>
+            <w:tcW w:w="3117" w:type="dxa"/>
+          </w:tcPr>
+          <w:p/>
+        </w:tc>
+      </w:tr>
+      <w:tr>
+        <w:tc>
+          <w:tcPr>
+            <w:tcW w:w="3116" w:type="dxa"/>
+          </w:tcPr>
+          <w:p/>
+        </w:tc>
+        <w:tc>
+          <w:tcPr>
+            <w:tcW w:w="3117" w:type="dxa"/>
+          </w:tcPr>
+          <w:p/>
+        </w:tc>
+        <w:tc>
+          <w:tcPr>
+            <w:tcW w:w="3117" w:type="dxa"/>
+          </w:tcPr>
+          <w:p/>
+        </w:tc>
+      </w:tr>
+    </w:tbl>
+    <w:p>
+      <w:pPr>
+        <w:ind w:left="2160"/>
+      </w:pPr>
+    </w:p>
+    <w:p>
+      <w:pPr>
+        <w:numPr>
+          <w:ilvl w:val="2"/>
+          <w:numId w:val="1"/>
+        </w:numPr>
+      </w:pPr>
+      <w:r>
+        <w:t>Story 2:</w:t>
+      </w:r>
+    </w:p>
+    <w:tbl>
+      <w:tblPr>
+        <w:tblStyle w:val="TableGrid"/>
+        <w:tblW w:w="0" w:type="auto"/>
+        <w:tblInd w:w="2160" w:type="dxa"/>
+        <w:tblLook w:val="04A0" w:firstRow="1" w:lastRow="0" w:firstColumn="1" w:lastColumn="0" w:noHBand="0" w:noVBand="1"/>
+      </w:tblPr>
+      <w:tblGrid>
+        <w:gridCol w:w="2303"/>
+        <w:gridCol w:w="2564"/>
+        <w:gridCol w:w="2323"/>
+      </w:tblGrid>
+      <w:tr>
+        <w:tc>
+          <w:tcPr>
+            <w:tcW w:w="3116" w:type="dxa"/>
+          </w:tcPr>
+          <w:p>
+            <w:r>
+              <w:t>Tasks</w:t>
+            </w:r>
+          </w:p>
+        </w:tc>
+        <w:tc>
+          <w:tcPr>
+            <w:tcW w:w="3117" w:type="dxa"/>
+          </w:tcPr>
+          <w:p>
+            <w:r>
+              <w:t>Descriptions</w:t>
+            </w:r>
+          </w:p>
+        </w:tc>
+        <w:tc>
+          <w:tcPr>
+            <w:tcW w:w="3117" w:type="dxa"/>
+          </w:tcPr>
+          <w:p>
+            <w:r>
+              <w:t>Hours</w:t>
+            </w:r>
+          </w:p>
+        </w:tc>
+      </w:tr>
+      <w:tr>
+        <w:tc>
+          <w:tcPr>
+            <w:tcW w:w="3116" w:type="dxa"/>
+          </w:tcPr>
+          <w:p/>
+        </w:tc>
+        <w:tc>
+          <w:tcPr>
+            <w:tcW w:w="3117" w:type="dxa"/>
+          </w:tcPr>
+          <w:p/>
+        </w:tc>
+        <w:tc>
+          <w:tcPr>
+            <w:tcW w:w="3117" w:type="dxa"/>
+          </w:tcPr>
+          <w:p/>
+        </w:tc>
+      </w:tr>
+      <w:tr>
+        <w:tc>
+          <w:tcPr>
+            <w:tcW w:w="3116" w:type="dxa"/>
+          </w:tcPr>
+          <w:p/>
+        </w:tc>
+        <w:tc>
+          <w:tcPr>
+            <w:tcW w:w="3117" w:type="dxa"/>
+          </w:tcPr>
+          <w:p/>
+        </w:tc>
+        <w:tc>
+          <w:tcPr>
+            <w:tcW w:w="3117" w:type="dxa"/>
+          </w:tcPr>
+          <w:p/>
+        </w:tc>
+      </w:tr>
+      <w:tr>
+        <w:tc>
+          <w:tcPr>
+            <w:tcW w:w="3116" w:type="dxa"/>
+          </w:tcPr>
+          <w:p/>
+        </w:tc>
+        <w:tc>
+          <w:tcPr>
+            <w:tcW w:w="3117" w:type="dxa"/>
+          </w:tcPr>
+          <w:p/>
+        </w:tc>
+        <w:tc>
+          <w:tcPr>
+            <w:tcW w:w="3117" w:type="dxa"/>
+          </w:tcPr>
+          <w:p/>
+        </w:tc>
+      </w:tr>
+      <w:tr>
+        <w:tc>
+          <w:tcPr>
+            <w:tcW w:w="3116" w:type="dxa"/>
+          </w:tcPr>
+          <w:p/>
+        </w:tc>
+        <w:tc>
+          <w:tcPr>
+            <w:tcW w:w="3117" w:type="dxa"/>
+          </w:tcPr>
+          <w:p/>
+        </w:tc>
+        <w:tc>
+          <w:tcPr>
+            <w:tcW w:w="3117" w:type="dxa"/>
+          </w:tcPr>
+          <w:p/>
+        </w:tc>
+      </w:tr>
+    </w:tbl>
+    <w:p>
+      <w:pPr>
+        <w:ind w:left="2160"/>
+      </w:pPr>
+    </w:p>
+    <w:p>
+      <w:pPr>
+        <w:numPr>
+          <w:ilvl w:val="2"/>
+          <w:numId w:val="1"/>
+        </w:numPr>
+      </w:pPr>
+      <w:r>
+        <w:t>Story 3:</w:t>
+      </w:r>
+    </w:p>
+    <w:tbl>
+      <w:tblPr>
+        <w:tblStyle w:val="TableGrid"/>
+        <w:tblW w:w="0" w:type="auto"/>
+        <w:tblInd w:w="2160" w:type="dxa"/>
+        <w:tblLook w:val="04A0" w:firstRow="1" w:lastRow="0" w:firstColumn="1" w:lastColumn="0" w:noHBand="0" w:noVBand="1"/>
+      </w:tblPr>
+      <w:tblGrid>
+        <w:gridCol w:w="2303"/>
+        <w:gridCol w:w="2564"/>
+        <w:gridCol w:w="2323"/>
+      </w:tblGrid>
+      <w:tr>
+        <w:tc>
+          <w:tcPr>
+            <w:tcW w:w="3116" w:type="dxa"/>
+          </w:tcPr>
+          <w:p>
+            <w:r>
+              <w:t>Tasks</w:t>
+            </w:r>
+          </w:p>
+        </w:tc>
+        <w:tc>
+          <w:tcPr>
+            <w:tcW w:w="3117" w:type="dxa"/>
+          </w:tcPr>
+          <w:p>
+            <w:r>
+              <w:t>Descriptions</w:t>
+            </w:r>
+          </w:p>
+        </w:tc>
+        <w:tc>
+          <w:tcPr>
+            <w:tcW w:w="3117" w:type="dxa"/>
+          </w:tcPr>
+          <w:p>
+            <w:r>
+              <w:t>Hours</w:t>
+            </w:r>
+          </w:p>
+        </w:tc>
+      </w:tr>
+      <w:tr>
+        <w:tc>
+          <w:tcPr>
+            <w:tcW w:w="3116" w:type="dxa"/>
+          </w:tcPr>
+          <w:p/>
+        </w:tc>
+        <w:tc>
+          <w:tcPr>
+            <w:tcW w:w="3117" w:type="dxa"/>
+          </w:tcPr>
+          <w:p/>
+        </w:tc>
+        <w:tc>
+          <w:tcPr>
+            <w:tcW w:w="3117" w:type="dxa"/>
+          </w:tcPr>
+          <w:p/>
+        </w:tc>
+      </w:tr>
+      <w:tr>
+        <w:tc>
+          <w:tcPr>
+            <w:tcW w:w="3116" w:type="dxa"/>
+          </w:tcPr>
+          <w:p/>
+        </w:tc>
+        <w:tc>
+          <w:tcPr>
+            <w:tcW w:w="3117" w:type="dxa"/>
+          </w:tcPr>
+          <w:p/>
+        </w:tc>
+        <w:tc>
+          <w:tcPr>
+            <w:tcW w:w="3117" w:type="dxa"/>
+          </w:tcPr>
+          <w:p/>
+        </w:tc>
+      </w:tr>
+      <w:tr>
+        <w:tc>
+          <w:tcPr>
+            <w:tcW w:w="3116" w:type="dxa"/>
+          </w:tcPr>
+          <w:p/>
+        </w:tc>
+        <w:tc>
+          <w:tcPr>
+            <w:tcW w:w="3117" w:type="dxa"/>
+          </w:tcPr>
+          <w:p/>
+        </w:tc>
+        <w:tc>
+          <w:tcPr>
+            <w:tcW w:w="3117" w:type="dxa"/>
+          </w:tcPr>
+          <w:p/>
+        </w:tc>
+      </w:tr>
+      <w:tr>
+        <w:tc>
+          <w:tcPr>
+            <w:tcW w:w="3116" w:type="dxa"/>
+          </w:tcPr>
+          <w:p/>
+        </w:tc>
+        <w:tc>
+          <w:tcPr>
+            <w:tcW w:w="3117" w:type="dxa"/>
+          </w:tcPr>
+          <w:p/>
+        </w:tc>
+        <w:tc>
+          <w:tcPr>
+            <w:tcW w:w="3117" w:type="dxa"/>
+          </w:tcPr>
+          <w:p/>
+        </w:tc>
+      </w:tr>
+    </w:tbl>
+    <w:p>
+      <w:pPr>
+        <w:ind w:left="2160"/>
+      </w:pPr>
+    </w:p>
+    <w:p>
+      <w:pPr>
+        <w:numPr>
           <w:ilvl w:val="0"/>
           <w:numId w:val="1"/>
         </w:numPr>
-      </w:pPr>
-      <w:r>
-        <w:t>1.5 Work Estimations (</w:t>
-      </w:r>
-      <w:proofErr w:type="spellStart"/>
-      <w:r>
-        <w:t>ToDo</w:t>
-      </w:r>
-      <w:proofErr w:type="spellEnd"/>
-      <w:r>
-        <w:t xml:space="preserve"> List)</w:t>
-      </w:r>
+        <w:shd w:val="clear" w:color="auto" w:fill="FFFFFF"/>
+        <w:spacing w:after="0" w:line="240" w:lineRule="auto"/>
+        <w:rPr>
+          <w:rFonts w:ascii="Open Sans" w:eastAsia="Times New Roman" w:hAnsi="Open Sans" w:cs="Open Sans"/>
+          <w:color w:val="262626"/>
+          <w:kern w:val="0"/>
+          <w14:ligatures w14:val="none"/>
+        </w:rPr>
+      </w:pPr>
+      <w:r>
+        <w:rPr>
+          <w:rFonts w:ascii="Open Sans" w:eastAsia="Times New Roman" w:hAnsi="Open Sans" w:cs="Open Sans"/>
+          <w:color w:val="262626"/>
+          <w:kern w:val="0"/>
+          <w14:ligatures w14:val="none"/>
+        </w:rPr>
+        <w:t>Design</w:t>
+      </w:r>
+    </w:p>
+    <w:p>
+      <w:pPr>
+        <w:numPr>
+          <w:ilvl w:val="1"/>
+          <w:numId w:val="1"/>
+        </w:numPr>
+        <w:shd w:val="clear" w:color="auto" w:fill="FFFFFF"/>
+        <w:spacing w:after="0" w:line="240" w:lineRule="auto"/>
+        <w:rPr>
+          <w:rFonts w:ascii="Open Sans" w:eastAsia="Times New Roman" w:hAnsi="Open Sans" w:cs="Open Sans"/>
+          <w:color w:val="262626"/>
+          <w:kern w:val="0"/>
+          <w14:ligatures w14:val="none"/>
+        </w:rPr>
+      </w:pPr>
+      <w:r>
+        <w:rPr>
+          <w:rFonts w:ascii="Open Sans" w:eastAsia="Times New Roman" w:hAnsi="Open Sans" w:cs="Open Sans"/>
+          <w:color w:val="262626"/>
+          <w:kern w:val="0"/>
+          <w14:ligatures w14:val="none"/>
+        </w:rPr>
+        <w:t>2.1 Prototypes</w:t>
+      </w:r>
+    </w:p>
+    <w:p>
+      <w:pPr>
+        <w:numPr>
+          <w:ilvl w:val="1"/>
+          <w:numId w:val="1"/>
+        </w:numPr>
+        <w:shd w:val="clear" w:color="auto" w:fill="FFFFFF"/>
+        <w:spacing w:after="0" w:line="240" w:lineRule="auto"/>
+        <w:rPr>
+          <w:rFonts w:ascii="Open Sans" w:eastAsia="Times New Roman" w:hAnsi="Open Sans" w:cs="Open Sans"/>
+          <w:color w:val="262626"/>
+          <w:kern w:val="0"/>
+          <w14:ligatures w14:val="none"/>
+        </w:rPr>
+      </w:pPr>
+      <w:r>
+        <w:rPr>
+          <w:rFonts w:ascii="Open Sans" w:eastAsia="Times New Roman" w:hAnsi="Open Sans" w:cs="Open Sans"/>
+          <w:color w:val="262626"/>
+          <w:kern w:val="0"/>
+          <w14:ligatures w14:val="none"/>
+        </w:rPr>
+        <w:t>2.2 ERD</w:t>
+      </w:r>
+    </w:p>
+    <w:p>
+      <w:pPr>
+        <w:numPr>
+          <w:ilvl w:val="0"/>
+          <w:numId w:val="1"/>
+        </w:numPr>
+        <w:shd w:val="clear" w:color="auto" w:fill="FFFFFF"/>
+        <w:spacing w:after="0" w:line="240" w:lineRule="auto"/>
+        <w:rPr>
+          <w:rFonts w:ascii="Open Sans" w:eastAsia="Times New Roman" w:hAnsi="Open Sans" w:cs="Open Sans"/>
+          <w:color w:val="262626"/>
+          <w:kern w:val="0"/>
+          <w14:ligatures w14:val="none"/>
+        </w:rPr>
+      </w:pPr>
+      <w:r>
+        <w:rPr>
+          <w:rFonts w:ascii="Open Sans" w:eastAsia="Times New Roman" w:hAnsi="Open Sans" w:cs="Open Sans"/>
+          <w:color w:val="262626"/>
+          <w:kern w:val="0"/>
+          <w14:ligatures w14:val="none"/>
+        </w:rPr>
+        <w:lastRenderedPageBreak/>
+        <w:t>QA Testing</w:t>
+      </w:r>
+    </w:p>
+    <w:p>
+      <w:pPr>
+        <w:numPr>
+          <w:ilvl w:val="1"/>
+          <w:numId w:val="1"/>
+        </w:numPr>
+        <w:shd w:val="clear" w:color="auto" w:fill="FFFFFF"/>
+        <w:spacing w:after="0" w:line="240" w:lineRule="auto"/>
+        <w:rPr>
+          <w:rFonts w:ascii="Open Sans" w:eastAsia="Times New Roman" w:hAnsi="Open Sans" w:cs="Open Sans"/>
+          <w:color w:val="262626"/>
+          <w:kern w:val="0"/>
+          <w14:ligatures w14:val="none"/>
+        </w:rPr>
+      </w:pPr>
+      <w:r>
+        <w:rPr>
+          <w:rFonts w:ascii="Open Sans" w:eastAsia="Times New Roman" w:hAnsi="Open Sans" w:cs="Open Sans"/>
+          <w:color w:val="262626"/>
+          <w:kern w:val="0"/>
+          <w14:ligatures w14:val="none"/>
+        </w:rPr>
+        <w:t>3.1 QA Test Plan</w:t>
+      </w:r>
+    </w:p>
+    <w:p>
+      <w:pPr>
+        <w:numPr>
+          <w:ilvl w:val="0"/>
+          <w:numId w:val="1"/>
+        </w:numPr>
+      </w:pPr>
     </w:p>
     <w:p/>
     <w:sectPr>
@@ -910,6 +1430,155 @@
 <file path=word/numbering.xml><?xml version="1.0" encoding="utf-8"?>
 <w:numbering xmlns:wpc="http://schemas.microsoft.com/office/word/2010/wordprocessingCanvas" xmlns:cx="http://schemas.microsoft.com/office/drawing/2014/chartex" xmlns:cx1="http://schemas.microsoft.com/office/drawing/2015/9/8/chartex" xmlns:cx2="http://schemas.microsoft.com/office/drawing/2015/10/21/chartex" xmlns:cx3="http://schemas.microsoft.com/office/drawing/2016/5/9/chartex" xmlns:cx4="http://schemas.microsoft.com/office/drawing/2016/5/10/chartex" xmlns:cx5="http://schemas.microsoft.com/office/drawing/2016/5/11/chartex" xmlns:cx6="http://schemas.microsoft.com/office/drawing/2016/5/12/chartex" xmlns:cx7="http://schemas.microsoft.com/office/drawing/2016/5/13/chartex" xmlns:cx8="http://schemas.microsoft.com/office/drawing/2016/5/14/chartex" xmlns:mc="http://schemas.openxmlformats.org/markup-compatibility/2006" xmlns:aink="http://schemas.microsoft.com/office/drawing/2016/ink" xmlns:am3d="http://schemas.microsoft.com/office/drawing/2017/model3d" xmlns:o="urn:schemas-microsoft-com:office:office" xmlns:oel="http://schemas.microsoft.com/office/2019/extlst" xmlns:r="http://schemas.openxmlformats.org/officeDocument/2006/relationships" xmlns:m="http://schemas.openxmlformats.org/officeDocument/2006/math" xmlns:v="urn:schemas-microsoft-com:vml" xmlns:wp14="http://schemas.microsoft.com/office/word/2010/wordprocessingDrawing" xmlns:wp="http://schemas.openxmlformats.org/drawingml/2006/wordprocessingDrawing" xmlns:w10="urn:schemas-microsoft-com:office:word" xmlns:w="http://schemas.openxmlformats.org/wordprocessingml/2006/main" xmlns:w14="http://schemas.microsoft.com/office/word/2010/wordml" xmlns:w15="http://schemas.microsoft.com/office/word/2012/wordml" xmlns:w16cex="http://schemas.microsoft.com/office/word/2018/wordml/cex" xmlns:w16cid="http://schemas.microsoft.com/office/word/2016/wordml/cid" xmlns:w16="http://schemas.microsoft.com/office/word/2018/wordml" xmlns:w16du="http://schemas.microsoft.com/office/word/2023/wordml/word16du" xmlns:w16sdtdh="http://schemas.microsoft.com/office/word/2020/wordml/sdtdatahash" xmlns:w16sdtfl="http://schemas.microsoft.com/office/word/2024/wordml/sdtformatlock" xmlns:w16se="http://schemas.microsoft.com/office/word/2015/wordml/symex" xmlns:wpg="http://schemas.microsoft.com/office/word/2010/wordprocessingGroup" xmlns:wpi="http://schemas.microsoft.com/office/word/2010/wordprocessingInk" xmlns:wne="http://schemas.microsoft.com/office/word/2006/wordml" xmlns:wps="http://schemas.microsoft.com/office/word/2010/wordprocessingShape" mc:Ignorable="w14 w15 w16se w16cid w16 w16cex w16sdtdh w16sdtfl w16du wp14">
   <w:abstractNum w:abstractNumId="0" w15:restartNumberingAfterBreak="0">
+    <w:nsid w:val="24DF4AF5"/>
+    <w:multiLevelType w:val="multilevel"/>
+    <w:tmpl w:val="B4E8B2E8"/>
+    <w:lvl w:ilvl="0">
+      <w:start w:val="1"/>
+      <w:numFmt w:val="bullet"/>
+      <w:lvlText w:val=""/>
+      <w:lvlJc w:val="left"/>
+      <w:pPr>
+        <w:tabs>
+          <w:tab w:val="num" w:pos="720"/>
+        </w:tabs>
+        <w:ind w:left="720" w:hanging="360"/>
+      </w:pPr>
+      <w:rPr>
+        <w:rFonts w:ascii="Symbol" w:hAnsi="Symbol" w:hint="default"/>
+        <w:sz w:val="20"/>
+      </w:rPr>
+    </w:lvl>
+    <w:lvl w:ilvl="1" w:tentative="1">
+      <w:start w:val="1"/>
+      <w:numFmt w:val="bullet"/>
+      <w:lvlText w:val="o"/>
+      <w:lvlJc w:val="left"/>
+      <w:pPr>
+        <w:tabs>
+          <w:tab w:val="num" w:pos="1440"/>
+        </w:tabs>
+        <w:ind w:left="1440" w:hanging="360"/>
+      </w:pPr>
+      <w:rPr>
+        <w:rFonts w:ascii="Courier New" w:hAnsi="Courier New" w:hint="default"/>
+        <w:sz w:val="20"/>
+      </w:rPr>
+    </w:lvl>
+    <w:lvl w:ilvl="2" w:tentative="1">
+      <w:start w:val="1"/>
+      <w:numFmt w:val="bullet"/>
+      <w:lvlText w:val=""/>
+      <w:lvlJc w:val="left"/>
+      <w:pPr>
+        <w:tabs>
+          <w:tab w:val="num" w:pos="2160"/>
+        </w:tabs>
+        <w:ind w:left="2160" w:hanging="360"/>
+      </w:pPr>
+      <w:rPr>
+        <w:rFonts w:ascii="Wingdings" w:hAnsi="Wingdings" w:hint="default"/>
+        <w:sz w:val="20"/>
+      </w:rPr>
+    </w:lvl>
+    <w:lvl w:ilvl="3" w:tentative="1">
+      <w:start w:val="1"/>
+      <w:numFmt w:val="bullet"/>
+      <w:lvlText w:val=""/>
+      <w:lvlJc w:val="left"/>
+      <w:pPr>
+        <w:tabs>
+          <w:tab w:val="num" w:pos="2880"/>
+        </w:tabs>
+        <w:ind w:left="2880" w:hanging="360"/>
+      </w:pPr>
+      <w:rPr>
+        <w:rFonts w:ascii="Wingdings" w:hAnsi="Wingdings" w:hint="default"/>
+        <w:sz w:val="20"/>
+      </w:rPr>
+    </w:lvl>
+    <w:lvl w:ilvl="4" w:tentative="1">
+      <w:start w:val="1"/>
+      <w:numFmt w:val="bullet"/>
+      <w:lvlText w:val=""/>
+      <w:lvlJc w:val="left"/>
+      <w:pPr>
+        <w:tabs>
+          <w:tab w:val="num" w:pos="3600"/>
+        </w:tabs>
+        <w:ind w:left="3600" w:hanging="360"/>
+      </w:pPr>
+      <w:rPr>
+        <w:rFonts w:ascii="Wingdings" w:hAnsi="Wingdings" w:hint="default"/>
+        <w:sz w:val="20"/>
+      </w:rPr>
+    </w:lvl>
+    <w:lvl w:ilvl="5" w:tentative="1">
+      <w:start w:val="1"/>
+      <w:numFmt w:val="bullet"/>
+      <w:lvlText w:val=""/>
+      <w:lvlJc w:val="left"/>
+      <w:pPr>
+        <w:tabs>
+          <w:tab w:val="num" w:pos="4320"/>
+        </w:tabs>
+        <w:ind w:left="4320" w:hanging="360"/>
+      </w:pPr>
+      <w:rPr>
+        <w:rFonts w:ascii="Wingdings" w:hAnsi="Wingdings" w:hint="default"/>
+        <w:sz w:val="20"/>
+      </w:rPr>
+    </w:lvl>
+    <w:lvl w:ilvl="6" w:tentative="1">
+      <w:start w:val="1"/>
+      <w:numFmt w:val="bullet"/>
+      <w:lvlText w:val=""/>
+      <w:lvlJc w:val="left"/>
+      <w:pPr>
+        <w:tabs>
+          <w:tab w:val="num" w:pos="5040"/>
+        </w:tabs>
+        <w:ind w:left="5040" w:hanging="360"/>
+      </w:pPr>
+      <w:rPr>
+        <w:rFonts w:ascii="Wingdings" w:hAnsi="Wingdings" w:hint="default"/>
+        <w:sz w:val="20"/>
+      </w:rPr>
+    </w:lvl>
+    <w:lvl w:ilvl="7" w:tentative="1">
+      <w:start w:val="1"/>
+      <w:numFmt w:val="bullet"/>
+      <w:lvlText w:val=""/>
+      <w:lvlJc w:val="left"/>
+      <w:pPr>
+        <w:tabs>
+          <w:tab w:val="num" w:pos="5760"/>
+        </w:tabs>
+        <w:ind w:left="5760" w:hanging="360"/>
+      </w:pPr>
+      <w:rPr>
+        <w:rFonts w:ascii="Wingdings" w:hAnsi="Wingdings" w:hint="default"/>
+        <w:sz w:val="20"/>
+      </w:rPr>
+    </w:lvl>
+    <w:lvl w:ilvl="8" w:tentative="1">
+      <w:start w:val="1"/>
+      <w:numFmt w:val="bullet"/>
+      <w:lvlText w:val=""/>
+      <w:lvlJc w:val="left"/>
+      <w:pPr>
+        <w:tabs>
+          <w:tab w:val="num" w:pos="6480"/>
+        </w:tabs>
+        <w:ind w:left="6480" w:hanging="360"/>
+      </w:pPr>
+      <w:rPr>
+        <w:rFonts w:ascii="Wingdings" w:hAnsi="Wingdings" w:hint="default"/>
+        <w:sz w:val="20"/>
+      </w:rPr>
+    </w:lvl>
+  </w:abstractNum>
+  <w:abstractNum w:abstractNumId="1" w15:restartNumberingAfterBreak="0">
     <w:nsid w:val="62616DCB"/>
     <w:multiLevelType w:val="multilevel"/>
     <w:tmpl w:val="8556A12E"/>
@@ -977,7 +1646,7 @@
         <w:sz w:val="20"/>
       </w:rPr>
     </w:lvl>
-    <w:lvl w:ilvl="4" w:tentative="1">
+    <w:lvl w:ilvl="4">
       <w:start w:val="1"/>
       <w:numFmt w:val="bullet"/>
       <w:lvlText w:val=""/>
@@ -1059,6 +1728,9 @@
     </w:lvl>
   </w:abstractNum>
   <w:num w:numId="1" w16cid:durableId="120073143">
+    <w:abstractNumId w:val="1"/>
+  </w:num>
+  <w:num w:numId="2" w16cid:durableId="69691896">
     <w:abstractNumId w:val="0"/>
   </w:num>
 </w:numbering>
@@ -1667,7 +2339,6 @@
   <w:style w:type="character" w:default="1" w:styleId="DefaultParagraphFont">
     <w:name w:val="Default Paragraph Font"/>
     <w:uiPriority w:val="1"/>
-    <w:semiHidden/>
     <w:unhideWhenUsed/>
   </w:style>
   <w:style w:type="table" w:default="1" w:styleId="TableNormal">
@@ -2043,6 +2714,19 @@
         <w:insideV w:val="single" w:sz="4" w:space="0" w:color="auto"/>
       </w:tblBorders>
     </w:tblPr>
+  </w:style>
+  <w:style w:type="paragraph" w:customStyle="1" w:styleId="ql-indent-1">
+    <w:name w:val="ql-indent-1"/>
+    <w:basedOn w:val="Normal"/>
+    <w:rsid w:val="00F84930"/>
+    <w:pPr>
+      <w:spacing w:before="100" w:beforeAutospacing="1" w:after="100" w:afterAutospacing="1" w:line="240" w:lineRule="auto"/>
+    </w:pPr>
+    <w:rPr>
+      <w:rFonts w:ascii="Times New Roman" w:eastAsia="Times New Roman" w:hAnsi="Times New Roman" w:cs="Times New Roman"/>
+      <w:kern w:val="0"/>
+      <w14:ligatures w14:val="none"/>
+    </w:rPr>
   </w:style>
 </w:styles>
 </file>

</xml_diff>

<commit_message>
Update to TDD 03/28/2026
</commit_message>
<xml_diff>
--- a/TDD/BravoTeam_TDD.docx
+++ b/TDD/BravoTeam_TDD.docx
@@ -824,6 +824,9 @@
       <w:r>
         <w:t>Story 1:</w:t>
       </w:r>
+      <w:r>
+        <w:t xml:space="preserve"> Zeke – User Login Functionality</w:t>
+      </w:r>
     </w:p>
     <w:tbl>
       <w:tblPr>
@@ -833,9 +836,9 @@
         <w:tblLook w:val="04A0" w:firstRow="1" w:lastRow="0" w:firstColumn="1" w:lastColumn="0" w:noHBand="0" w:noVBand="1"/>
       </w:tblPr>
       <w:tblGrid>
-        <w:gridCol w:w="2303"/>
-        <w:gridCol w:w="2564"/>
-        <w:gridCol w:w="2323"/>
+        <w:gridCol w:w="2497"/>
+        <w:gridCol w:w="2601"/>
+        <w:gridCol w:w="2092"/>
       </w:tblGrid>
       <w:tr>
         <w:tc>
@@ -874,19 +877,31 @@
           <w:tcPr>
             <w:tcW w:w="3116" w:type="dxa"/>
           </w:tcPr>
-          <w:p/>
+          <w:p>
+            <w:r>
+              <w:t>Design Login UI</w:t>
+            </w:r>
+          </w:p>
         </w:tc>
         <w:tc>
           <w:tcPr>
             <w:tcW w:w="3117" w:type="dxa"/>
           </w:tcPr>
-          <w:p/>
+          <w:p>
+            <w:r>
+              <w:t>Create the login page layout including email/username, password fields, and validation messages</w:t>
+            </w:r>
+          </w:p>
         </w:tc>
         <w:tc>
           <w:tcPr>
             <w:tcW w:w="3117" w:type="dxa"/>
           </w:tcPr>
-          <w:p/>
+          <w:p>
+            <w:r>
+              <w:t>4 hours</w:t>
+            </w:r>
+          </w:p>
         </w:tc>
       </w:tr>
       <w:tr>
@@ -894,19 +909,31 @@
           <w:tcPr>
             <w:tcW w:w="3116" w:type="dxa"/>
           </w:tcPr>
-          <w:p/>
+          <w:p>
+            <w:r>
+              <w:t>Implement Authentication Logic</w:t>
+            </w:r>
+          </w:p>
         </w:tc>
         <w:tc>
           <w:tcPr>
             <w:tcW w:w="3117" w:type="dxa"/>
           </w:tcPr>
-          <w:p/>
+          <w:p>
+            <w:r>
+              <w:t>Develop backend logic to validate user credentials against the database, including password hashing and session handling.</w:t>
+            </w:r>
+          </w:p>
         </w:tc>
         <w:tc>
           <w:tcPr>
             <w:tcW w:w="3117" w:type="dxa"/>
           </w:tcPr>
-          <w:p/>
+          <w:p>
+            <w:r>
+              <w:t>6 hours</w:t>
+            </w:r>
+          </w:p>
         </w:tc>
       </w:tr>
       <w:tr>
@@ -914,19 +941,36 @@
           <w:tcPr>
             <w:tcW w:w="3116" w:type="dxa"/>
           </w:tcPr>
-          <w:p/>
+          <w:p>
+            <w:r>
+              <w:t>Error Handling &amp; Validation</w:t>
+            </w:r>
+          </w:p>
         </w:tc>
         <w:tc>
           <w:tcPr>
             <w:tcW w:w="3117" w:type="dxa"/>
           </w:tcPr>
-          <w:p/>
+          <w:p>
+            <w:r>
+              <w:t xml:space="preserve">Add input validation (empty fields, invalid formats) and display </w:t>
+            </w:r>
+            <w:r>
+              <w:lastRenderedPageBreak/>
+              <w:t>appropriate error messages for failed login attempts.</w:t>
+            </w:r>
+          </w:p>
         </w:tc>
         <w:tc>
           <w:tcPr>
             <w:tcW w:w="3117" w:type="dxa"/>
           </w:tcPr>
-          <w:p/>
+          <w:p>
+            <w:r>
+              <w:lastRenderedPageBreak/>
+              <w:t>3 hours</w:t>
+            </w:r>
+          </w:p>
         </w:tc>
       </w:tr>
       <w:tr>
@@ -934,19 +978,31 @@
           <w:tcPr>
             <w:tcW w:w="3116" w:type="dxa"/>
           </w:tcPr>
-          <w:p/>
+          <w:p>
+            <w:r>
+              <w:t>Testing &amp; Debugging</w:t>
+            </w:r>
+          </w:p>
         </w:tc>
         <w:tc>
           <w:tcPr>
             <w:tcW w:w="3117" w:type="dxa"/>
           </w:tcPr>
-          <w:p/>
+          <w:p>
+            <w:r>
+              <w:t>Perform unit and integration testing to ensure login works correctly, including edge cases like incorrect credentials and session timeouts.</w:t>
+            </w:r>
+          </w:p>
         </w:tc>
         <w:tc>
           <w:tcPr>
             <w:tcW w:w="3117" w:type="dxa"/>
           </w:tcPr>
-          <w:p/>
+          <w:p>
+            <w:r>
+              <w:t>3 hours</w:t>
+            </w:r>
+          </w:p>
         </w:tc>
       </w:tr>
     </w:tbl>
@@ -964,6 +1020,9 @@
       </w:pPr>
       <w:r>
         <w:t>Story 2:</w:t>
+      </w:r>
+      <w:r>
+        <w:t xml:space="preserve"> Jordan – Room Price Comparison Feature</w:t>
       </w:r>
     </w:p>
     <w:tbl>
@@ -974,9 +1033,9 @@
         <w:tblLook w:val="04A0" w:firstRow="1" w:lastRow="0" w:firstColumn="1" w:lastColumn="0" w:noHBand="0" w:noVBand="1"/>
       </w:tblPr>
       <w:tblGrid>
-        <w:gridCol w:w="2303"/>
-        <w:gridCol w:w="2564"/>
-        <w:gridCol w:w="2323"/>
+        <w:gridCol w:w="2447"/>
+        <w:gridCol w:w="2566"/>
+        <w:gridCol w:w="2177"/>
       </w:tblGrid>
       <w:tr>
         <w:tc>
@@ -1015,19 +1074,31 @@
           <w:tcPr>
             <w:tcW w:w="3116" w:type="dxa"/>
           </w:tcPr>
-          <w:p/>
+          <w:p>
+            <w:r>
+              <w:t>Design Comparison Interface</w:t>
+            </w:r>
+          </w:p>
         </w:tc>
         <w:tc>
           <w:tcPr>
             <w:tcW w:w="3117" w:type="dxa"/>
           </w:tcPr>
-          <w:p/>
+          <w:p>
+            <w:r>
+              <w:t>Create a UI that displays multiple room options side-by-side with pricing, dates, and basic details.</w:t>
+            </w:r>
+          </w:p>
         </w:tc>
         <w:tc>
           <w:tcPr>
             <w:tcW w:w="3117" w:type="dxa"/>
           </w:tcPr>
-          <w:p/>
+          <w:p>
+            <w:r>
+              <w:t>5 hours</w:t>
+            </w:r>
+          </w:p>
         </w:tc>
       </w:tr>
       <w:tr>
@@ -1035,19 +1106,31 @@
           <w:tcPr>
             <w:tcW w:w="3116" w:type="dxa"/>
           </w:tcPr>
-          <w:p/>
+          <w:p>
+            <w:r>
+              <w:t>Develop Price Retrieval Logic</w:t>
+            </w:r>
+          </w:p>
         </w:tc>
         <w:tc>
           <w:tcPr>
             <w:tcW w:w="3117" w:type="dxa"/>
           </w:tcPr>
-          <w:p/>
+          <w:p>
+            <w:r>
+              <w:t>Implement backend functionality to fetch room pricing data from the database or API.</w:t>
+            </w:r>
+          </w:p>
         </w:tc>
         <w:tc>
           <w:tcPr>
             <w:tcW w:w="3117" w:type="dxa"/>
           </w:tcPr>
-          <w:p/>
+          <w:p>
+            <w:r>
+              <w:t>6 hours</w:t>
+            </w:r>
+          </w:p>
         </w:tc>
       </w:tr>
       <w:tr>
@@ -1055,19 +1138,31 @@
           <w:tcPr>
             <w:tcW w:w="3116" w:type="dxa"/>
           </w:tcPr>
-          <w:p/>
+          <w:p>
+            <w:r>
+              <w:t>Implement Sorting &amp; Filtering</w:t>
+            </w:r>
+          </w:p>
         </w:tc>
         <w:tc>
           <w:tcPr>
             <w:tcW w:w="3117" w:type="dxa"/>
           </w:tcPr>
-          <w:p/>
+          <w:p>
+            <w:r>
+              <w:t>Allow users to sort by price (low to high, high to low) and filter based on criteria like room type or date.</w:t>
+            </w:r>
+          </w:p>
         </w:tc>
         <w:tc>
           <w:tcPr>
             <w:tcW w:w="3117" w:type="dxa"/>
           </w:tcPr>
-          <w:p/>
+          <w:p>
+            <w:r>
+              <w:t>4 hours</w:t>
+            </w:r>
+          </w:p>
         </w:tc>
       </w:tr>
       <w:tr>
@@ -1075,19 +1170,31 @@
           <w:tcPr>
             <w:tcW w:w="3116" w:type="dxa"/>
           </w:tcPr>
-          <w:p/>
+          <w:p>
+            <w:r>
+              <w:t>Testing &amp; Data Validation</w:t>
+            </w:r>
+          </w:p>
         </w:tc>
         <w:tc>
           <w:tcPr>
             <w:tcW w:w="3117" w:type="dxa"/>
           </w:tcPr>
-          <w:p/>
+          <w:p>
+            <w:r>
+              <w:t>Verify accurate pricing display and ensure sorting/filtering works correctly across different datasets.</w:t>
+            </w:r>
+          </w:p>
         </w:tc>
         <w:tc>
           <w:tcPr>
             <w:tcW w:w="3117" w:type="dxa"/>
           </w:tcPr>
-          <w:p/>
+          <w:p>
+            <w:r>
+              <w:t>3 hours</w:t>
+            </w:r>
+          </w:p>
         </w:tc>
       </w:tr>
     </w:tbl>
@@ -1104,8 +1211,10 @@
         </w:numPr>
       </w:pPr>
       <w:r>
-        <w:lastRenderedPageBreak/>
         <w:t>Story 3:</w:t>
+      </w:r>
+      <w:r>
+        <w:t xml:space="preserve"> Emily – Amenities Display Feature</w:t>
       </w:r>
     </w:p>
     <w:tbl>
@@ -1116,9 +1225,9 @@
         <w:tblLook w:val="04A0" w:firstRow="1" w:lastRow="0" w:firstColumn="1" w:lastColumn="0" w:noHBand="0" w:noVBand="1"/>
       </w:tblPr>
       <w:tblGrid>
-        <w:gridCol w:w="2303"/>
-        <w:gridCol w:w="2564"/>
-        <w:gridCol w:w="2323"/>
+        <w:gridCol w:w="2410"/>
+        <w:gridCol w:w="2608"/>
+        <w:gridCol w:w="2172"/>
       </w:tblGrid>
       <w:tr>
         <w:tc>
@@ -1157,19 +1266,31 @@
           <w:tcPr>
             <w:tcW w:w="3116" w:type="dxa"/>
           </w:tcPr>
-          <w:p/>
+          <w:p>
+            <w:r>
+              <w:t>Design Amenities UI Section</w:t>
+            </w:r>
+          </w:p>
         </w:tc>
         <w:tc>
           <w:tcPr>
             <w:tcW w:w="3117" w:type="dxa"/>
           </w:tcPr>
-          <w:p/>
+          <w:p>
+            <w:r>
+              <w:t>Create a visually appealing section to display amenities (icons, descriptions, categories).</w:t>
+            </w:r>
+          </w:p>
         </w:tc>
         <w:tc>
           <w:tcPr>
             <w:tcW w:w="3117" w:type="dxa"/>
           </w:tcPr>
-          <w:p/>
+          <w:p>
+            <w:r>
+              <w:t>4 hours</w:t>
+            </w:r>
+          </w:p>
         </w:tc>
       </w:tr>
       <w:tr>
@@ -1177,19 +1298,32 @@
           <w:tcPr>
             <w:tcW w:w="3116" w:type="dxa"/>
           </w:tcPr>
-          <w:p/>
+          <w:p>
+            <w:r>
+              <w:lastRenderedPageBreak/>
+              <w:t>Fetch Amenities Data</w:t>
+            </w:r>
+          </w:p>
         </w:tc>
         <w:tc>
           <w:tcPr>
             <w:tcW w:w="3117" w:type="dxa"/>
           </w:tcPr>
-          <w:p/>
+          <w:p>
+            <w:r>
+              <w:t>Implement backend/API calls to retrieve amenities associated with each room or property.</w:t>
+            </w:r>
+          </w:p>
         </w:tc>
         <w:tc>
           <w:tcPr>
             <w:tcW w:w="3117" w:type="dxa"/>
           </w:tcPr>
-          <w:p/>
+          <w:p>
+            <w:r>
+              <w:t>5 hours</w:t>
+            </w:r>
+          </w:p>
         </w:tc>
       </w:tr>
       <w:tr>
@@ -1197,19 +1331,31 @@
           <w:tcPr>
             <w:tcW w:w="3116" w:type="dxa"/>
           </w:tcPr>
-          <w:p/>
+          <w:p>
+            <w:r>
+              <w:t>Integrate Amenities with Room Listings</w:t>
+            </w:r>
+          </w:p>
         </w:tc>
         <w:tc>
           <w:tcPr>
             <w:tcW w:w="3117" w:type="dxa"/>
           </w:tcPr>
-          <w:p/>
+          <w:p>
+            <w:r>
+              <w:t>Ensure amenities dynamically display when users view specific rooms or hotel options.</w:t>
+            </w:r>
+          </w:p>
         </w:tc>
         <w:tc>
           <w:tcPr>
             <w:tcW w:w="3117" w:type="dxa"/>
           </w:tcPr>
-          <w:p/>
+          <w:p>
+            <w:r>
+              <w:t>4 hours</w:t>
+            </w:r>
+          </w:p>
         </w:tc>
       </w:tr>
       <w:tr>
@@ -1217,19 +1363,31 @@
           <w:tcPr>
             <w:tcW w:w="3116" w:type="dxa"/>
           </w:tcPr>
-          <w:p/>
+          <w:p>
+            <w:r>
+              <w:t>Testing &amp; UI Refinement</w:t>
+            </w:r>
+          </w:p>
         </w:tc>
         <w:tc>
           <w:tcPr>
             <w:tcW w:w="3117" w:type="dxa"/>
           </w:tcPr>
-          <w:p/>
+          <w:p>
+            <w:r>
+              <w:t>Test for correct data display and refine layout for usability and responsiveness.</w:t>
+            </w:r>
+          </w:p>
         </w:tc>
         <w:tc>
           <w:tcPr>
             <w:tcW w:w="3117" w:type="dxa"/>
           </w:tcPr>
-          <w:p/>
+          <w:p>
+            <w:r>
+              <w:t>3 hours</w:t>
+            </w:r>
+          </w:p>
         </w:tc>
       </w:tr>
     </w:tbl>
@@ -1441,7 +1599,15 @@
       <w:jc w:val="right"/>
     </w:pPr>
     <w:r>
-      <w:t>Zachary Anderson, Angela Vargas, Tevyah Hanley, Cameron</w:t>
+      <w:t xml:space="preserve">Zachary Anderson, Angela Vargas, </w:t>
+    </w:r>
+    <w:proofErr w:type="spellStart"/>
+    <w:r>
+      <w:t>Tevyah</w:t>
+    </w:r>
+    <w:proofErr w:type="spellEnd"/>
+    <w:r>
+      <w:t xml:space="preserve"> Hanley, Cameron</w:t>
     </w:r>
     <w:r>
       <w:t xml:space="preserve"> Mendez</w:t>
@@ -2371,7 +2537,6 @@
   <w:style w:type="character" w:default="1" w:styleId="DefaultParagraphFont">
     <w:name w:val="Default Paragraph Font"/>
     <w:uiPriority w:val="1"/>
-    <w:semiHidden/>
     <w:unhideWhenUsed/>
   </w:style>
   <w:style w:type="table" w:default="1" w:styleId="TableNormal">

</xml_diff>

<commit_message>
Restore TDD file that was accidentally removed in PR
</commit_message>
<xml_diff>
--- a/TDD/BravoTeam_TDD.docx
+++ b/TDD/BravoTeam_TDD.docx
@@ -22,10 +22,7 @@
         </w:numPr>
       </w:pPr>
       <w:r>
-        <w:t>Introduction</w:t>
-      </w:r>
-      <w:r>
-        <w:t xml:space="preserve"> </w:t>
+        <w:t xml:space="preserve">Introduction </w:t>
       </w:r>
     </w:p>
     <w:p>
@@ -65,7 +62,7 @@
     <w:p>
       <w:pPr>
         <w:numPr>
-          <w:ilvl w:val="0"/>
+          <w:ilvl w:val="1"/>
           <w:numId w:val="1"/>
         </w:numPr>
       </w:pPr>
@@ -76,7 +73,7 @@
     <w:p>
       <w:pPr>
         <w:numPr>
-          <w:ilvl w:val="1"/>
+          <w:ilvl w:val="2"/>
           <w:numId w:val="1"/>
         </w:numPr>
       </w:pPr>
@@ -237,15 +234,7 @@
           </w:tcPr>
           <w:p>
             <w:r>
-              <w:t xml:space="preserve">Not logged in </w:t>
-            </w:r>
-            <w:proofErr w:type="gramStart"/>
-            <w:r>
-              <w:t>visitor</w:t>
-            </w:r>
-            <w:proofErr w:type="gramEnd"/>
-            <w:r>
-              <w:t xml:space="preserve"> to the site</w:t>
+              <w:t>Not logged in visitor to the site</w:t>
             </w:r>
           </w:p>
         </w:tc>
@@ -255,7 +244,7 @@
     <w:p>
       <w:pPr>
         <w:numPr>
-          <w:ilvl w:val="0"/>
+          <w:ilvl w:val="1"/>
           <w:numId w:val="1"/>
         </w:numPr>
       </w:pPr>
@@ -266,7 +255,7 @@
     <w:p>
       <w:pPr>
         <w:numPr>
-          <w:ilvl w:val="1"/>
+          <w:ilvl w:val="2"/>
           <w:numId w:val="1"/>
         </w:numPr>
       </w:pPr>
@@ -277,7 +266,7 @@
     <w:p>
       <w:pPr>
         <w:numPr>
-          <w:ilvl w:val="2"/>
+          <w:ilvl w:val="3"/>
           <w:numId w:val="1"/>
         </w:numPr>
       </w:pPr>
@@ -288,7 +277,7 @@
     <w:p>
       <w:pPr>
         <w:numPr>
-          <w:ilvl w:val="2"/>
+          <w:ilvl w:val="3"/>
           <w:numId w:val="1"/>
         </w:numPr>
       </w:pPr>
@@ -299,7 +288,7 @@
     <w:p>
       <w:pPr>
         <w:numPr>
-          <w:ilvl w:val="2"/>
+          <w:ilvl w:val="3"/>
           <w:numId w:val="1"/>
         </w:numPr>
       </w:pPr>
@@ -310,7 +299,7 @@
     <w:p>
       <w:pPr>
         <w:numPr>
-          <w:ilvl w:val="2"/>
+          <w:ilvl w:val="3"/>
           <w:numId w:val="1"/>
         </w:numPr>
       </w:pPr>
@@ -321,52 +310,52 @@
     <w:p>
       <w:pPr>
         <w:numPr>
+          <w:ilvl w:val="4"/>
+          <w:numId w:val="1"/>
+        </w:numPr>
+      </w:pPr>
+      <w:r>
+        <w:t>Register</w:t>
+      </w:r>
+      <w:r>
+        <w:t xml:space="preserve"> immediately, hoping for deals</w:t>
+      </w:r>
+    </w:p>
+    <w:p>
+      <w:pPr>
+        <w:numPr>
+          <w:ilvl w:val="4"/>
+          <w:numId w:val="1"/>
+        </w:numPr>
+      </w:pPr>
+      <w:r>
+        <w:t>Look</w:t>
+      </w:r>
+      <w:r>
+        <w:t xml:space="preserve"> into </w:t>
+      </w:r>
+      <w:r>
+        <w:t xml:space="preserve">the </w:t>
+      </w:r>
+      <w:r>
+        <w:t>amenities offered at the lodge</w:t>
+      </w:r>
+    </w:p>
+    <w:p>
+      <w:pPr>
+        <w:numPr>
           <w:ilvl w:val="3"/>
           <w:numId w:val="1"/>
         </w:numPr>
       </w:pPr>
       <w:r>
-        <w:t>Register</w:t>
-      </w:r>
-      <w:r>
-        <w:t xml:space="preserve"> immediately, hoping for deals</w:t>
-      </w:r>
-    </w:p>
-    <w:p>
-      <w:pPr>
-        <w:numPr>
-          <w:ilvl w:val="3"/>
-          <w:numId w:val="1"/>
-        </w:numPr>
-      </w:pPr>
-      <w:r>
-        <w:t>Look</w:t>
-      </w:r>
-      <w:r>
-        <w:t xml:space="preserve"> into </w:t>
-      </w:r>
-      <w:r>
-        <w:t xml:space="preserve">the </w:t>
-      </w:r>
-      <w:r>
-        <w:t>amenities offered at the lodge</w:t>
-      </w:r>
-    </w:p>
-    <w:p>
-      <w:pPr>
-        <w:numPr>
-          <w:ilvl w:val="2"/>
-          <w:numId w:val="1"/>
-        </w:numPr>
-      </w:pPr>
-      <w:r>
         <w:t>Needs:</w:t>
       </w:r>
     </w:p>
     <w:p>
       <w:pPr>
         <w:numPr>
-          <w:ilvl w:val="3"/>
+          <w:ilvl w:val="4"/>
           <w:numId w:val="1"/>
         </w:numPr>
       </w:pPr>
@@ -377,7 +366,7 @@
     <w:p>
       <w:pPr>
         <w:numPr>
-          <w:ilvl w:val="3"/>
+          <w:ilvl w:val="4"/>
           <w:numId w:val="1"/>
         </w:numPr>
       </w:pPr>
@@ -389,18 +378,271 @@
     <w:p>
       <w:pPr>
         <w:numPr>
+          <w:ilvl w:val="4"/>
+          <w:numId w:val="1"/>
+        </w:numPr>
+      </w:pPr>
+      <w:r>
+        <w:t>Room with a view</w:t>
+      </w:r>
+    </w:p>
+    <w:p>
+      <w:pPr>
+        <w:ind w:left="2880"/>
+      </w:pPr>
+    </w:p>
+    <w:p>
+      <w:pPr>
+        <w:numPr>
+          <w:ilvl w:val="2"/>
+          <w:numId w:val="1"/>
+        </w:numPr>
+      </w:pPr>
+      <w:r>
+        <w:t>Persona 2: College Student Traveler</w:t>
+      </w:r>
+    </w:p>
+    <w:p>
+      <w:pPr>
+        <w:numPr>
           <w:ilvl w:val="3"/>
           <w:numId w:val="1"/>
         </w:numPr>
       </w:pPr>
       <w:r>
-        <w:t>Room with a view</w:t>
-      </w:r>
-    </w:p>
-    <w:p>
-      <w:pPr>
-        <w:numPr>
-          <w:ilvl w:val="0"/>
+        <w:t>Name: Jordan Miller</w:t>
+      </w:r>
+    </w:p>
+    <w:p>
+      <w:pPr>
+        <w:numPr>
+          <w:ilvl w:val="3"/>
+          <w:numId w:val="1"/>
+        </w:numPr>
+      </w:pPr>
+      <w:r>
+        <w:t>Age: 22</w:t>
+      </w:r>
+    </w:p>
+    <w:p>
+      <w:pPr>
+        <w:numPr>
+          <w:ilvl w:val="3"/>
+          <w:numId w:val="1"/>
+        </w:numPr>
+      </w:pPr>
+      <w:r>
+        <w:t>Goal: Save money while booking a quick and easy stay</w:t>
+      </w:r>
+    </w:p>
+    <w:p>
+      <w:pPr>
+        <w:numPr>
+          <w:ilvl w:val="3"/>
+          <w:numId w:val="1"/>
+        </w:numPr>
+      </w:pPr>
+      <w:r>
+        <w:t>Behavior:</w:t>
+      </w:r>
+    </w:p>
+    <w:p>
+      <w:pPr>
+        <w:numPr>
+          <w:ilvl w:val="4"/>
+          <w:numId w:val="1"/>
+        </w:numPr>
+      </w:pPr>
+      <w:r>
+        <w:t>Compares prices before booking</w:t>
+      </w:r>
+    </w:p>
+    <w:p>
+      <w:pPr>
+        <w:numPr>
+          <w:ilvl w:val="4"/>
+          <w:numId w:val="1"/>
+        </w:numPr>
+      </w:pPr>
+      <w:r>
+        <w:t>Prefers a fast and easy reservation process</w:t>
+      </w:r>
+    </w:p>
+    <w:p>
+      <w:pPr>
+        <w:numPr>
+          <w:ilvl w:val="3"/>
+          <w:numId w:val="1"/>
+        </w:numPr>
+      </w:pPr>
+      <w:r>
+        <w:t>Needs:</w:t>
+      </w:r>
+    </w:p>
+    <w:p>
+      <w:pPr>
+        <w:numPr>
+          <w:ilvl w:val="4"/>
+          <w:numId w:val="1"/>
+        </w:numPr>
+      </w:pPr>
+      <w:r>
+        <w:t>Clear and transparent pricing</w:t>
+      </w:r>
+    </w:p>
+    <w:p>
+      <w:pPr>
+        <w:numPr>
+          <w:ilvl w:val="4"/>
+          <w:numId w:val="1"/>
+        </w:numPr>
+      </w:pPr>
+      <w:r>
+        <w:t>Fast login system</w:t>
+      </w:r>
+    </w:p>
+    <w:p>
+      <w:pPr>
+        <w:numPr>
+          <w:ilvl w:val="4"/>
+          <w:numId w:val="1"/>
+        </w:numPr>
+      </w:pPr>
+      <w:r>
+        <w:t>Simple booking process</w:t>
+      </w:r>
+    </w:p>
+    <w:p>
+      <w:pPr>
+        <w:ind w:left="2160"/>
+      </w:pPr>
+    </w:p>
+    <w:p>
+      <w:pPr>
+        <w:numPr>
+          <w:ilvl w:val="2"/>
+          <w:numId w:val="1"/>
+        </w:numPr>
+      </w:pPr>
+      <w:r>
+        <w:t>Persona 3: Vacationing Couple</w:t>
+      </w:r>
+    </w:p>
+    <w:p>
+      <w:pPr>
+        <w:numPr>
+          <w:ilvl w:val="3"/>
+          <w:numId w:val="1"/>
+        </w:numPr>
+      </w:pPr>
+      <w:r>
+        <w:t>Name: Emily Davis</w:t>
+      </w:r>
+    </w:p>
+    <w:p>
+      <w:pPr>
+        <w:numPr>
+          <w:ilvl w:val="3"/>
+          <w:numId w:val="1"/>
+        </w:numPr>
+      </w:pPr>
+      <w:r>
+        <w:t>Age: 30</w:t>
+      </w:r>
+    </w:p>
+    <w:p>
+      <w:pPr>
+        <w:numPr>
+          <w:ilvl w:val="3"/>
+          <w:numId w:val="1"/>
+        </w:numPr>
+      </w:pPr>
+      <w:r>
+        <w:t>Goal: Relax and enjoy a well-planned vacation</w:t>
+      </w:r>
+    </w:p>
+    <w:p>
+      <w:pPr>
+        <w:numPr>
+          <w:ilvl w:val="3"/>
+          <w:numId w:val="1"/>
+        </w:numPr>
+      </w:pPr>
+      <w:r>
+        <w:t>Behavior:</w:t>
+      </w:r>
+    </w:p>
+    <w:p>
+      <w:pPr>
+        <w:numPr>
+          <w:ilvl w:val="4"/>
+          <w:numId w:val="1"/>
+        </w:numPr>
+      </w:pPr>
+      <w:r>
+        <w:t>Plans everything ahead of time</w:t>
+      </w:r>
+    </w:p>
+    <w:p>
+      <w:pPr>
+        <w:numPr>
+          <w:ilvl w:val="4"/>
+          <w:numId w:val="1"/>
+        </w:numPr>
+      </w:pPr>
+      <w:r>
+        <w:t>Takes time choosing the best room option</w:t>
+      </w:r>
+    </w:p>
+    <w:p>
+      <w:pPr>
+        <w:numPr>
+          <w:ilvl w:val="3"/>
+          <w:numId w:val="1"/>
+        </w:numPr>
+      </w:pPr>
+      <w:r>
+        <w:t>Needs:</w:t>
+      </w:r>
+    </w:p>
+    <w:p>
+      <w:pPr>
+        <w:numPr>
+          <w:ilvl w:val="4"/>
+          <w:numId w:val="1"/>
+        </w:numPr>
+      </w:pPr>
+      <w:r>
+        <w:t>Variety of room options</w:t>
+      </w:r>
+    </w:p>
+    <w:p>
+      <w:pPr>
+        <w:numPr>
+          <w:ilvl w:val="4"/>
+          <w:numId w:val="1"/>
+        </w:numPr>
+      </w:pPr>
+      <w:r>
+        <w:t>Detailed amenities information</w:t>
+      </w:r>
+    </w:p>
+    <w:p>
+      <w:pPr>
+        <w:numPr>
+          <w:ilvl w:val="4"/>
+          <w:numId w:val="1"/>
+        </w:numPr>
+      </w:pPr>
+      <w:r>
+        <w:t>Easy reservation planning</w:t>
+      </w:r>
+    </w:p>
+    <w:p/>
+    <w:p>
+      <w:pPr>
+        <w:numPr>
+          <w:ilvl w:val="1"/>
           <w:numId w:val="1"/>
         </w:numPr>
       </w:pPr>
@@ -416,10 +658,10 @@
         <w:tblLook w:val="04A0" w:firstRow="1" w:lastRow="0" w:firstColumn="1" w:lastColumn="0" w:noHBand="0" w:noVBand="1"/>
       </w:tblPr>
       <w:tblGrid>
-        <w:gridCol w:w="1855"/>
-        <w:gridCol w:w="2084"/>
-        <w:gridCol w:w="1987"/>
-        <w:gridCol w:w="1984"/>
+        <w:gridCol w:w="1838"/>
+        <w:gridCol w:w="2064"/>
+        <w:gridCol w:w="2004"/>
+        <w:gridCol w:w="2004"/>
       </w:tblGrid>
       <w:tr>
         <w:tc>
@@ -468,25 +710,41 @@
           <w:tcPr>
             <w:tcW w:w="2337" w:type="dxa"/>
           </w:tcPr>
-          <w:p/>
+          <w:p>
+            <w:r>
+              <w:t>Jordan Miller</w:t>
+            </w:r>
+          </w:p>
         </w:tc>
         <w:tc>
           <w:tcPr>
             <w:tcW w:w="2337" w:type="dxa"/>
           </w:tcPr>
-          <w:p/>
+          <w:p>
+            <w:r>
+              <w:t>As a user, I want to compare room prices so that I can choose the most affordable option.</w:t>
+            </w:r>
+          </w:p>
         </w:tc>
         <w:tc>
           <w:tcPr>
             <w:tcW w:w="2338" w:type="dxa"/>
           </w:tcPr>
-          <w:p/>
+          <w:p>
+            <w:r>
+              <w:t>As a registered user, I want to log in quickly so that I can book a reservation without wasting time.</w:t>
+            </w:r>
+          </w:p>
         </w:tc>
         <w:tc>
           <w:tcPr>
             <w:tcW w:w="2338" w:type="dxa"/>
           </w:tcPr>
-          <w:p/>
+          <w:p>
+            <w:r>
+              <w:t>As a user, I want a simple booking process so that I can complete my reservation easily.</w:t>
+            </w:r>
+          </w:p>
         </w:tc>
       </w:tr>
       <w:tr>
@@ -494,25 +752,41 @@
           <w:tcPr>
             <w:tcW w:w="2337" w:type="dxa"/>
           </w:tcPr>
-          <w:p/>
+          <w:p>
+            <w:r>
+              <w:t>Emily Davis</w:t>
+            </w:r>
+          </w:p>
         </w:tc>
         <w:tc>
           <w:tcPr>
             <w:tcW w:w="2337" w:type="dxa"/>
           </w:tcPr>
-          <w:p/>
+          <w:p>
+            <w:r>
+              <w:t>As a user, I want to view detailed room options so that I can choose the best experience for my stay.</w:t>
+            </w:r>
+          </w:p>
         </w:tc>
         <w:tc>
           <w:tcPr>
             <w:tcW w:w="2338" w:type="dxa"/>
           </w:tcPr>
-          <w:p/>
+          <w:p>
+            <w:r>
+              <w:t>As a user, I want to see available amenities so that I can plan a relaxing vacation.</w:t>
+            </w:r>
+          </w:p>
         </w:tc>
         <w:tc>
           <w:tcPr>
             <w:tcW w:w="2338" w:type="dxa"/>
           </w:tcPr>
-          <w:p/>
+          <w:p>
+            <w:r>
+              <w:t>As a user, I want to book my stay in advance so that I can secure my preferred dates.</w:t>
+            </w:r>
+          </w:p>
         </w:tc>
       </w:tr>
     </w:tbl>
@@ -524,21 +798,736 @@
     <w:p>
       <w:pPr>
         <w:numPr>
+          <w:ilvl w:val="1"/>
+          <w:numId w:val="1"/>
+        </w:numPr>
+      </w:pPr>
+      <w:r>
+        <w:t>1.5 Work Estimations (</w:t>
+      </w:r>
+      <w:proofErr w:type="spellStart"/>
+      <w:r>
+        <w:t>ToDo</w:t>
+      </w:r>
+      <w:proofErr w:type="spellEnd"/>
+      <w:r>
+        <w:t xml:space="preserve"> List)</w:t>
+      </w:r>
+    </w:p>
+    <w:p>
+      <w:pPr>
+        <w:numPr>
+          <w:ilvl w:val="2"/>
+          <w:numId w:val="1"/>
+        </w:numPr>
+      </w:pPr>
+      <w:r>
+        <w:t>Story 1:</w:t>
+      </w:r>
+      <w:r>
+        <w:t xml:space="preserve"> Zeke – User Login Functionality</w:t>
+      </w:r>
+    </w:p>
+    <w:tbl>
+      <w:tblPr>
+        <w:tblStyle w:val="TableGrid"/>
+        <w:tblW w:w="0" w:type="auto"/>
+        <w:tblInd w:w="2160" w:type="dxa"/>
+        <w:tblLook w:val="04A0" w:firstRow="1" w:lastRow="0" w:firstColumn="1" w:lastColumn="0" w:noHBand="0" w:noVBand="1"/>
+      </w:tblPr>
+      <w:tblGrid>
+        <w:gridCol w:w="2497"/>
+        <w:gridCol w:w="2601"/>
+        <w:gridCol w:w="2092"/>
+      </w:tblGrid>
+      <w:tr>
+        <w:tc>
+          <w:tcPr>
+            <w:tcW w:w="3116" w:type="dxa"/>
+          </w:tcPr>
+          <w:p>
+            <w:r>
+              <w:t>Tasks</w:t>
+            </w:r>
+          </w:p>
+        </w:tc>
+        <w:tc>
+          <w:tcPr>
+            <w:tcW w:w="3117" w:type="dxa"/>
+          </w:tcPr>
+          <w:p>
+            <w:r>
+              <w:t>Descriptions</w:t>
+            </w:r>
+          </w:p>
+        </w:tc>
+        <w:tc>
+          <w:tcPr>
+            <w:tcW w:w="3117" w:type="dxa"/>
+          </w:tcPr>
+          <w:p>
+            <w:r>
+              <w:t>Hours</w:t>
+            </w:r>
+          </w:p>
+        </w:tc>
+      </w:tr>
+      <w:tr>
+        <w:tc>
+          <w:tcPr>
+            <w:tcW w:w="3116" w:type="dxa"/>
+          </w:tcPr>
+          <w:p>
+            <w:r>
+              <w:t>Design Login UI</w:t>
+            </w:r>
+          </w:p>
+        </w:tc>
+        <w:tc>
+          <w:tcPr>
+            <w:tcW w:w="3117" w:type="dxa"/>
+          </w:tcPr>
+          <w:p>
+            <w:r>
+              <w:t>Create the login page layout including email/username, password fields, and validation messages</w:t>
+            </w:r>
+          </w:p>
+        </w:tc>
+        <w:tc>
+          <w:tcPr>
+            <w:tcW w:w="3117" w:type="dxa"/>
+          </w:tcPr>
+          <w:p>
+            <w:r>
+              <w:t>4 hours</w:t>
+            </w:r>
+          </w:p>
+        </w:tc>
+      </w:tr>
+      <w:tr>
+        <w:tc>
+          <w:tcPr>
+            <w:tcW w:w="3116" w:type="dxa"/>
+          </w:tcPr>
+          <w:p>
+            <w:r>
+              <w:t>Implement Authentication Logic</w:t>
+            </w:r>
+          </w:p>
+        </w:tc>
+        <w:tc>
+          <w:tcPr>
+            <w:tcW w:w="3117" w:type="dxa"/>
+          </w:tcPr>
+          <w:p>
+            <w:r>
+              <w:t>Develop backend logic to validate user credentials against the database, including password hashing and session handling.</w:t>
+            </w:r>
+          </w:p>
+        </w:tc>
+        <w:tc>
+          <w:tcPr>
+            <w:tcW w:w="3117" w:type="dxa"/>
+          </w:tcPr>
+          <w:p>
+            <w:r>
+              <w:t>6 hours</w:t>
+            </w:r>
+          </w:p>
+        </w:tc>
+      </w:tr>
+      <w:tr>
+        <w:tc>
+          <w:tcPr>
+            <w:tcW w:w="3116" w:type="dxa"/>
+          </w:tcPr>
+          <w:p>
+            <w:r>
+              <w:t>Error Handling &amp; Validation</w:t>
+            </w:r>
+          </w:p>
+        </w:tc>
+        <w:tc>
+          <w:tcPr>
+            <w:tcW w:w="3117" w:type="dxa"/>
+          </w:tcPr>
+          <w:p>
+            <w:r>
+              <w:t xml:space="preserve">Add input validation (empty fields, invalid formats) and display </w:t>
+            </w:r>
+            <w:r>
+              <w:lastRenderedPageBreak/>
+              <w:t>appropriate error messages for failed login attempts.</w:t>
+            </w:r>
+          </w:p>
+        </w:tc>
+        <w:tc>
+          <w:tcPr>
+            <w:tcW w:w="3117" w:type="dxa"/>
+          </w:tcPr>
+          <w:p>
+            <w:r>
+              <w:lastRenderedPageBreak/>
+              <w:t>3 hours</w:t>
+            </w:r>
+          </w:p>
+        </w:tc>
+      </w:tr>
+      <w:tr>
+        <w:tc>
+          <w:tcPr>
+            <w:tcW w:w="3116" w:type="dxa"/>
+          </w:tcPr>
+          <w:p>
+            <w:r>
+              <w:t>Testing &amp; Debugging</w:t>
+            </w:r>
+          </w:p>
+        </w:tc>
+        <w:tc>
+          <w:tcPr>
+            <w:tcW w:w="3117" w:type="dxa"/>
+          </w:tcPr>
+          <w:p>
+            <w:r>
+              <w:t>Perform unit and integration testing to ensure login works correctly, including edge cases like incorrect credentials and session timeouts.</w:t>
+            </w:r>
+          </w:p>
+        </w:tc>
+        <w:tc>
+          <w:tcPr>
+            <w:tcW w:w="3117" w:type="dxa"/>
+          </w:tcPr>
+          <w:p>
+            <w:r>
+              <w:t>3 hours</w:t>
+            </w:r>
+          </w:p>
+        </w:tc>
+      </w:tr>
+    </w:tbl>
+    <w:p>
+      <w:pPr>
+        <w:ind w:left="2160"/>
+      </w:pPr>
+    </w:p>
+    <w:p>
+      <w:pPr>
+        <w:numPr>
+          <w:ilvl w:val="2"/>
+          <w:numId w:val="1"/>
+        </w:numPr>
+      </w:pPr>
+      <w:r>
+        <w:t>Story 2:</w:t>
+      </w:r>
+      <w:r>
+        <w:t xml:space="preserve"> Jordan – Room Price Comparison Feature</w:t>
+      </w:r>
+    </w:p>
+    <w:tbl>
+      <w:tblPr>
+        <w:tblStyle w:val="TableGrid"/>
+        <w:tblW w:w="0" w:type="auto"/>
+        <w:tblInd w:w="2160" w:type="dxa"/>
+        <w:tblLook w:val="04A0" w:firstRow="1" w:lastRow="0" w:firstColumn="1" w:lastColumn="0" w:noHBand="0" w:noVBand="1"/>
+      </w:tblPr>
+      <w:tblGrid>
+        <w:gridCol w:w="2447"/>
+        <w:gridCol w:w="2566"/>
+        <w:gridCol w:w="2177"/>
+      </w:tblGrid>
+      <w:tr>
+        <w:tc>
+          <w:tcPr>
+            <w:tcW w:w="3116" w:type="dxa"/>
+          </w:tcPr>
+          <w:p>
+            <w:r>
+              <w:t>Tasks</w:t>
+            </w:r>
+          </w:p>
+        </w:tc>
+        <w:tc>
+          <w:tcPr>
+            <w:tcW w:w="3117" w:type="dxa"/>
+          </w:tcPr>
+          <w:p>
+            <w:r>
+              <w:t>Descriptions</w:t>
+            </w:r>
+          </w:p>
+        </w:tc>
+        <w:tc>
+          <w:tcPr>
+            <w:tcW w:w="3117" w:type="dxa"/>
+          </w:tcPr>
+          <w:p>
+            <w:r>
+              <w:t>Hours</w:t>
+            </w:r>
+          </w:p>
+        </w:tc>
+      </w:tr>
+      <w:tr>
+        <w:tc>
+          <w:tcPr>
+            <w:tcW w:w="3116" w:type="dxa"/>
+          </w:tcPr>
+          <w:p>
+            <w:r>
+              <w:t>Design Comparison Interface</w:t>
+            </w:r>
+          </w:p>
+        </w:tc>
+        <w:tc>
+          <w:tcPr>
+            <w:tcW w:w="3117" w:type="dxa"/>
+          </w:tcPr>
+          <w:p>
+            <w:r>
+              <w:t>Create a UI that displays multiple room options side-by-side with pricing, dates, and basic details.</w:t>
+            </w:r>
+          </w:p>
+        </w:tc>
+        <w:tc>
+          <w:tcPr>
+            <w:tcW w:w="3117" w:type="dxa"/>
+          </w:tcPr>
+          <w:p>
+            <w:r>
+              <w:t>5 hours</w:t>
+            </w:r>
+          </w:p>
+        </w:tc>
+      </w:tr>
+      <w:tr>
+        <w:tc>
+          <w:tcPr>
+            <w:tcW w:w="3116" w:type="dxa"/>
+          </w:tcPr>
+          <w:p>
+            <w:r>
+              <w:t>Develop Price Retrieval Logic</w:t>
+            </w:r>
+          </w:p>
+        </w:tc>
+        <w:tc>
+          <w:tcPr>
+            <w:tcW w:w="3117" w:type="dxa"/>
+          </w:tcPr>
+          <w:p>
+            <w:r>
+              <w:t>Implement backend functionality to fetch room pricing data from the database or API.</w:t>
+            </w:r>
+          </w:p>
+        </w:tc>
+        <w:tc>
+          <w:tcPr>
+            <w:tcW w:w="3117" w:type="dxa"/>
+          </w:tcPr>
+          <w:p>
+            <w:r>
+              <w:t>6 hours</w:t>
+            </w:r>
+          </w:p>
+        </w:tc>
+      </w:tr>
+      <w:tr>
+        <w:tc>
+          <w:tcPr>
+            <w:tcW w:w="3116" w:type="dxa"/>
+          </w:tcPr>
+          <w:p>
+            <w:r>
+              <w:t>Implement Sorting &amp; Filtering</w:t>
+            </w:r>
+          </w:p>
+        </w:tc>
+        <w:tc>
+          <w:tcPr>
+            <w:tcW w:w="3117" w:type="dxa"/>
+          </w:tcPr>
+          <w:p>
+            <w:r>
+              <w:t>Allow users to sort by price (low to high, high to low) and filter based on criteria like room type or date.</w:t>
+            </w:r>
+          </w:p>
+        </w:tc>
+        <w:tc>
+          <w:tcPr>
+            <w:tcW w:w="3117" w:type="dxa"/>
+          </w:tcPr>
+          <w:p>
+            <w:r>
+              <w:t>4 hours</w:t>
+            </w:r>
+          </w:p>
+        </w:tc>
+      </w:tr>
+      <w:tr>
+        <w:tc>
+          <w:tcPr>
+            <w:tcW w:w="3116" w:type="dxa"/>
+          </w:tcPr>
+          <w:p>
+            <w:r>
+              <w:t>Testing &amp; Data Validation</w:t>
+            </w:r>
+          </w:p>
+        </w:tc>
+        <w:tc>
+          <w:tcPr>
+            <w:tcW w:w="3117" w:type="dxa"/>
+          </w:tcPr>
+          <w:p>
+            <w:r>
+              <w:t>Verify accurate pricing display and ensure sorting/filtering works correctly across different datasets.</w:t>
+            </w:r>
+          </w:p>
+        </w:tc>
+        <w:tc>
+          <w:tcPr>
+            <w:tcW w:w="3117" w:type="dxa"/>
+          </w:tcPr>
+          <w:p>
+            <w:r>
+              <w:t>3 hours</w:t>
+            </w:r>
+          </w:p>
+        </w:tc>
+      </w:tr>
+    </w:tbl>
+    <w:p>
+      <w:pPr>
+        <w:ind w:left="2160"/>
+      </w:pPr>
+    </w:p>
+    <w:p>
+      <w:pPr>
+        <w:numPr>
+          <w:ilvl w:val="2"/>
+          <w:numId w:val="1"/>
+        </w:numPr>
+      </w:pPr>
+      <w:r>
+        <w:t>Story 3:</w:t>
+      </w:r>
+      <w:r>
+        <w:t xml:space="preserve"> Emily – Amenities Display Feature</w:t>
+      </w:r>
+    </w:p>
+    <w:tbl>
+      <w:tblPr>
+        <w:tblStyle w:val="TableGrid"/>
+        <w:tblW w:w="0" w:type="auto"/>
+        <w:tblInd w:w="2160" w:type="dxa"/>
+        <w:tblLook w:val="04A0" w:firstRow="1" w:lastRow="0" w:firstColumn="1" w:lastColumn="0" w:noHBand="0" w:noVBand="1"/>
+      </w:tblPr>
+      <w:tblGrid>
+        <w:gridCol w:w="2410"/>
+        <w:gridCol w:w="2608"/>
+        <w:gridCol w:w="2172"/>
+      </w:tblGrid>
+      <w:tr>
+        <w:tc>
+          <w:tcPr>
+            <w:tcW w:w="3116" w:type="dxa"/>
+          </w:tcPr>
+          <w:p>
+            <w:r>
+              <w:t>Tasks</w:t>
+            </w:r>
+          </w:p>
+        </w:tc>
+        <w:tc>
+          <w:tcPr>
+            <w:tcW w:w="3117" w:type="dxa"/>
+          </w:tcPr>
+          <w:p>
+            <w:r>
+              <w:t>Descriptions</w:t>
+            </w:r>
+          </w:p>
+        </w:tc>
+        <w:tc>
+          <w:tcPr>
+            <w:tcW w:w="3117" w:type="dxa"/>
+          </w:tcPr>
+          <w:p>
+            <w:r>
+              <w:t>Hours</w:t>
+            </w:r>
+          </w:p>
+        </w:tc>
+      </w:tr>
+      <w:tr>
+        <w:tc>
+          <w:tcPr>
+            <w:tcW w:w="3116" w:type="dxa"/>
+          </w:tcPr>
+          <w:p>
+            <w:r>
+              <w:t>Design Amenities UI Section</w:t>
+            </w:r>
+          </w:p>
+        </w:tc>
+        <w:tc>
+          <w:tcPr>
+            <w:tcW w:w="3117" w:type="dxa"/>
+          </w:tcPr>
+          <w:p>
+            <w:r>
+              <w:t>Create a visually appealing section to display amenities (icons, descriptions, categories).</w:t>
+            </w:r>
+          </w:p>
+        </w:tc>
+        <w:tc>
+          <w:tcPr>
+            <w:tcW w:w="3117" w:type="dxa"/>
+          </w:tcPr>
+          <w:p>
+            <w:r>
+              <w:t>4 hours</w:t>
+            </w:r>
+          </w:p>
+        </w:tc>
+      </w:tr>
+      <w:tr>
+        <w:tc>
+          <w:tcPr>
+            <w:tcW w:w="3116" w:type="dxa"/>
+          </w:tcPr>
+          <w:p>
+            <w:r>
+              <w:lastRenderedPageBreak/>
+              <w:t>Fetch Amenities Data</w:t>
+            </w:r>
+          </w:p>
+        </w:tc>
+        <w:tc>
+          <w:tcPr>
+            <w:tcW w:w="3117" w:type="dxa"/>
+          </w:tcPr>
+          <w:p>
+            <w:r>
+              <w:t>Implement backend/API calls to retrieve amenities associated with each room or property.</w:t>
+            </w:r>
+          </w:p>
+        </w:tc>
+        <w:tc>
+          <w:tcPr>
+            <w:tcW w:w="3117" w:type="dxa"/>
+          </w:tcPr>
+          <w:p>
+            <w:r>
+              <w:t>5 hours</w:t>
+            </w:r>
+          </w:p>
+        </w:tc>
+      </w:tr>
+      <w:tr>
+        <w:tc>
+          <w:tcPr>
+            <w:tcW w:w="3116" w:type="dxa"/>
+          </w:tcPr>
+          <w:p>
+            <w:r>
+              <w:t>Integrate Amenities with Room Listings</w:t>
+            </w:r>
+          </w:p>
+        </w:tc>
+        <w:tc>
+          <w:tcPr>
+            <w:tcW w:w="3117" w:type="dxa"/>
+          </w:tcPr>
+          <w:p>
+            <w:r>
+              <w:t>Ensure amenities dynamically display when users view specific rooms or hotel options.</w:t>
+            </w:r>
+          </w:p>
+        </w:tc>
+        <w:tc>
+          <w:tcPr>
+            <w:tcW w:w="3117" w:type="dxa"/>
+          </w:tcPr>
+          <w:p>
+            <w:r>
+              <w:t>4 hours</w:t>
+            </w:r>
+          </w:p>
+        </w:tc>
+      </w:tr>
+      <w:tr>
+        <w:tc>
+          <w:tcPr>
+            <w:tcW w:w="3116" w:type="dxa"/>
+          </w:tcPr>
+          <w:p>
+            <w:r>
+              <w:t>Testing &amp; UI Refinement</w:t>
+            </w:r>
+          </w:p>
+        </w:tc>
+        <w:tc>
+          <w:tcPr>
+            <w:tcW w:w="3117" w:type="dxa"/>
+          </w:tcPr>
+          <w:p>
+            <w:r>
+              <w:t>Test for correct data display and refine layout for usability and responsiveness.</w:t>
+            </w:r>
+          </w:p>
+        </w:tc>
+        <w:tc>
+          <w:tcPr>
+            <w:tcW w:w="3117" w:type="dxa"/>
+          </w:tcPr>
+          <w:p>
+            <w:r>
+              <w:t>3 hours</w:t>
+            </w:r>
+          </w:p>
+        </w:tc>
+      </w:tr>
+    </w:tbl>
+    <w:p>
+      <w:pPr>
+        <w:ind w:left="2160"/>
+      </w:pPr>
+    </w:p>
+    <w:p>
+      <w:pPr>
+        <w:numPr>
           <w:ilvl w:val="0"/>
           <w:numId w:val="1"/>
         </w:numPr>
-      </w:pPr>
-      <w:r>
-        <w:t>1.5 Work Estimations (</w:t>
-      </w:r>
-      <w:proofErr w:type="spellStart"/>
-      <w:r>
-        <w:t>ToDo</w:t>
-      </w:r>
-      <w:proofErr w:type="spellEnd"/>
-      <w:r>
-        <w:t xml:space="preserve"> List)</w:t>
-      </w:r>
+        <w:shd w:val="clear" w:color="auto" w:fill="FFFFFF"/>
+        <w:spacing w:after="0" w:line="240" w:lineRule="auto"/>
+        <w:rPr>
+          <w:rFonts w:ascii="Open Sans" w:eastAsia="Times New Roman" w:hAnsi="Open Sans" w:cs="Open Sans"/>
+          <w:color w:val="262626"/>
+          <w:kern w:val="0"/>
+          <w14:ligatures w14:val="none"/>
+        </w:rPr>
+      </w:pPr>
+      <w:r>
+        <w:rPr>
+          <w:rFonts w:ascii="Open Sans" w:eastAsia="Times New Roman" w:hAnsi="Open Sans" w:cs="Open Sans"/>
+          <w:color w:val="262626"/>
+          <w:kern w:val="0"/>
+          <w14:ligatures w14:val="none"/>
+        </w:rPr>
+        <w:t>Design</w:t>
+      </w:r>
+    </w:p>
+    <w:p>
+      <w:pPr>
+        <w:numPr>
+          <w:ilvl w:val="1"/>
+          <w:numId w:val="1"/>
+        </w:numPr>
+        <w:shd w:val="clear" w:color="auto" w:fill="FFFFFF"/>
+        <w:spacing w:after="0" w:line="240" w:lineRule="auto"/>
+        <w:rPr>
+          <w:rFonts w:ascii="Open Sans" w:eastAsia="Times New Roman" w:hAnsi="Open Sans" w:cs="Open Sans"/>
+          <w:color w:val="262626"/>
+          <w:kern w:val="0"/>
+          <w14:ligatures w14:val="none"/>
+        </w:rPr>
+      </w:pPr>
+      <w:r>
+        <w:rPr>
+          <w:rFonts w:ascii="Open Sans" w:eastAsia="Times New Roman" w:hAnsi="Open Sans" w:cs="Open Sans"/>
+          <w:color w:val="262626"/>
+          <w:kern w:val="0"/>
+          <w14:ligatures w14:val="none"/>
+        </w:rPr>
+        <w:t>2.1 Prototypes</w:t>
+      </w:r>
+    </w:p>
+    <w:p>
+      <w:pPr>
+        <w:numPr>
+          <w:ilvl w:val="1"/>
+          <w:numId w:val="1"/>
+        </w:numPr>
+        <w:shd w:val="clear" w:color="auto" w:fill="FFFFFF"/>
+        <w:spacing w:after="0" w:line="240" w:lineRule="auto"/>
+        <w:rPr>
+          <w:rFonts w:ascii="Open Sans" w:eastAsia="Times New Roman" w:hAnsi="Open Sans" w:cs="Open Sans"/>
+          <w:color w:val="262626"/>
+          <w:kern w:val="0"/>
+          <w14:ligatures w14:val="none"/>
+        </w:rPr>
+      </w:pPr>
+      <w:r>
+        <w:rPr>
+          <w:rFonts w:ascii="Open Sans" w:eastAsia="Times New Roman" w:hAnsi="Open Sans" w:cs="Open Sans"/>
+          <w:color w:val="262626"/>
+          <w:kern w:val="0"/>
+          <w14:ligatures w14:val="none"/>
+        </w:rPr>
+        <w:t>2.2 ERD</w:t>
+      </w:r>
+    </w:p>
+    <w:p>
+      <w:pPr>
+        <w:numPr>
+          <w:ilvl w:val="0"/>
+          <w:numId w:val="1"/>
+        </w:numPr>
+        <w:shd w:val="clear" w:color="auto" w:fill="FFFFFF"/>
+        <w:spacing w:after="0" w:line="240" w:lineRule="auto"/>
+        <w:rPr>
+          <w:rFonts w:ascii="Open Sans" w:eastAsia="Times New Roman" w:hAnsi="Open Sans" w:cs="Open Sans"/>
+          <w:color w:val="262626"/>
+          <w:kern w:val="0"/>
+          <w14:ligatures w14:val="none"/>
+        </w:rPr>
+      </w:pPr>
+      <w:r>
+        <w:rPr>
+          <w:rFonts w:ascii="Open Sans" w:eastAsia="Times New Roman" w:hAnsi="Open Sans" w:cs="Open Sans"/>
+          <w:color w:val="262626"/>
+          <w:kern w:val="0"/>
+          <w14:ligatures w14:val="none"/>
+        </w:rPr>
+        <w:t>QA Testing</w:t>
+      </w:r>
+    </w:p>
+    <w:p>
+      <w:pPr>
+        <w:numPr>
+          <w:ilvl w:val="1"/>
+          <w:numId w:val="1"/>
+        </w:numPr>
+        <w:shd w:val="clear" w:color="auto" w:fill="FFFFFF"/>
+        <w:spacing w:after="0" w:line="240" w:lineRule="auto"/>
+        <w:rPr>
+          <w:rFonts w:ascii="Open Sans" w:eastAsia="Times New Roman" w:hAnsi="Open Sans" w:cs="Open Sans"/>
+          <w:color w:val="262626"/>
+          <w:kern w:val="0"/>
+          <w14:ligatures w14:val="none"/>
+        </w:rPr>
+      </w:pPr>
+      <w:r>
+        <w:rPr>
+          <w:rFonts w:ascii="Open Sans" w:eastAsia="Times New Roman" w:hAnsi="Open Sans" w:cs="Open Sans"/>
+          <w:color w:val="262626"/>
+          <w:kern w:val="0"/>
+          <w14:ligatures w14:val="none"/>
+        </w:rPr>
+        <w:t>3.1 QA Test Plan</w:t>
+      </w:r>
+    </w:p>
+    <w:p>
+      <w:pPr>
+        <w:numPr>
+          <w:ilvl w:val="0"/>
+          <w:numId w:val="1"/>
+        </w:numPr>
+      </w:pPr>
     </w:p>
     <w:p/>
     <w:sectPr>
@@ -639,6 +1628,155 @@
 <file path=word/numbering.xml><?xml version="1.0" encoding="utf-8"?>
 <w:numbering xmlns:wpc="http://schemas.microsoft.com/office/word/2010/wordprocessingCanvas" xmlns:cx="http://schemas.microsoft.com/office/drawing/2014/chartex" xmlns:cx1="http://schemas.microsoft.com/office/drawing/2015/9/8/chartex" xmlns:cx2="http://schemas.microsoft.com/office/drawing/2015/10/21/chartex" xmlns:cx3="http://schemas.microsoft.com/office/drawing/2016/5/9/chartex" xmlns:cx4="http://schemas.microsoft.com/office/drawing/2016/5/10/chartex" xmlns:cx5="http://schemas.microsoft.com/office/drawing/2016/5/11/chartex" xmlns:cx6="http://schemas.microsoft.com/office/drawing/2016/5/12/chartex" xmlns:cx7="http://schemas.microsoft.com/office/drawing/2016/5/13/chartex" xmlns:cx8="http://schemas.microsoft.com/office/drawing/2016/5/14/chartex" xmlns:mc="http://schemas.openxmlformats.org/markup-compatibility/2006" xmlns:aink="http://schemas.microsoft.com/office/drawing/2016/ink" xmlns:am3d="http://schemas.microsoft.com/office/drawing/2017/model3d" xmlns:o="urn:schemas-microsoft-com:office:office" xmlns:oel="http://schemas.microsoft.com/office/2019/extlst" xmlns:r="http://schemas.openxmlformats.org/officeDocument/2006/relationships" xmlns:m="http://schemas.openxmlformats.org/officeDocument/2006/math" xmlns:v="urn:schemas-microsoft-com:vml" xmlns:wp14="http://schemas.microsoft.com/office/word/2010/wordprocessingDrawing" xmlns:wp="http://schemas.openxmlformats.org/drawingml/2006/wordprocessingDrawing" xmlns:w10="urn:schemas-microsoft-com:office:word" xmlns:w="http://schemas.openxmlformats.org/wordprocessingml/2006/main" xmlns:w14="http://schemas.microsoft.com/office/word/2010/wordml" xmlns:w15="http://schemas.microsoft.com/office/word/2012/wordml" xmlns:w16cex="http://schemas.microsoft.com/office/word/2018/wordml/cex" xmlns:w16cid="http://schemas.microsoft.com/office/word/2016/wordml/cid" xmlns:w16="http://schemas.microsoft.com/office/word/2018/wordml" xmlns:w16du="http://schemas.microsoft.com/office/word/2023/wordml/word16du" xmlns:w16sdtdh="http://schemas.microsoft.com/office/word/2020/wordml/sdtdatahash" xmlns:w16sdtfl="http://schemas.microsoft.com/office/word/2024/wordml/sdtformatlock" xmlns:w16se="http://schemas.microsoft.com/office/word/2015/wordml/symex" xmlns:wpg="http://schemas.microsoft.com/office/word/2010/wordprocessingGroup" xmlns:wpi="http://schemas.microsoft.com/office/word/2010/wordprocessingInk" xmlns:wne="http://schemas.microsoft.com/office/word/2006/wordml" xmlns:wps="http://schemas.microsoft.com/office/word/2010/wordprocessingShape" mc:Ignorable="w14 w15 w16se w16cid w16 w16cex w16sdtdh w16sdtfl w16du wp14">
   <w:abstractNum w:abstractNumId="0" w15:restartNumberingAfterBreak="0">
+    <w:nsid w:val="24DF4AF5"/>
+    <w:multiLevelType w:val="multilevel"/>
+    <w:tmpl w:val="B4E8B2E8"/>
+    <w:lvl w:ilvl="0">
+      <w:start w:val="1"/>
+      <w:numFmt w:val="bullet"/>
+      <w:lvlText w:val=""/>
+      <w:lvlJc w:val="left"/>
+      <w:pPr>
+        <w:tabs>
+          <w:tab w:val="num" w:pos="720"/>
+        </w:tabs>
+        <w:ind w:left="720" w:hanging="360"/>
+      </w:pPr>
+      <w:rPr>
+        <w:rFonts w:ascii="Symbol" w:hAnsi="Symbol" w:hint="default"/>
+        <w:sz w:val="20"/>
+      </w:rPr>
+    </w:lvl>
+    <w:lvl w:ilvl="1" w:tentative="1">
+      <w:start w:val="1"/>
+      <w:numFmt w:val="bullet"/>
+      <w:lvlText w:val="o"/>
+      <w:lvlJc w:val="left"/>
+      <w:pPr>
+        <w:tabs>
+          <w:tab w:val="num" w:pos="1440"/>
+        </w:tabs>
+        <w:ind w:left="1440" w:hanging="360"/>
+      </w:pPr>
+      <w:rPr>
+        <w:rFonts w:ascii="Courier New" w:hAnsi="Courier New" w:hint="default"/>
+        <w:sz w:val="20"/>
+      </w:rPr>
+    </w:lvl>
+    <w:lvl w:ilvl="2" w:tentative="1">
+      <w:start w:val="1"/>
+      <w:numFmt w:val="bullet"/>
+      <w:lvlText w:val=""/>
+      <w:lvlJc w:val="left"/>
+      <w:pPr>
+        <w:tabs>
+          <w:tab w:val="num" w:pos="2160"/>
+        </w:tabs>
+        <w:ind w:left="2160" w:hanging="360"/>
+      </w:pPr>
+      <w:rPr>
+        <w:rFonts w:ascii="Wingdings" w:hAnsi="Wingdings" w:hint="default"/>
+        <w:sz w:val="20"/>
+      </w:rPr>
+    </w:lvl>
+    <w:lvl w:ilvl="3" w:tentative="1">
+      <w:start w:val="1"/>
+      <w:numFmt w:val="bullet"/>
+      <w:lvlText w:val=""/>
+      <w:lvlJc w:val="left"/>
+      <w:pPr>
+        <w:tabs>
+          <w:tab w:val="num" w:pos="2880"/>
+        </w:tabs>
+        <w:ind w:left="2880" w:hanging="360"/>
+      </w:pPr>
+      <w:rPr>
+        <w:rFonts w:ascii="Wingdings" w:hAnsi="Wingdings" w:hint="default"/>
+        <w:sz w:val="20"/>
+      </w:rPr>
+    </w:lvl>
+    <w:lvl w:ilvl="4" w:tentative="1">
+      <w:start w:val="1"/>
+      <w:numFmt w:val="bullet"/>
+      <w:lvlText w:val=""/>
+      <w:lvlJc w:val="left"/>
+      <w:pPr>
+        <w:tabs>
+          <w:tab w:val="num" w:pos="3600"/>
+        </w:tabs>
+        <w:ind w:left="3600" w:hanging="360"/>
+      </w:pPr>
+      <w:rPr>
+        <w:rFonts w:ascii="Wingdings" w:hAnsi="Wingdings" w:hint="default"/>
+        <w:sz w:val="20"/>
+      </w:rPr>
+    </w:lvl>
+    <w:lvl w:ilvl="5" w:tentative="1">
+      <w:start w:val="1"/>
+      <w:numFmt w:val="bullet"/>
+      <w:lvlText w:val=""/>
+      <w:lvlJc w:val="left"/>
+      <w:pPr>
+        <w:tabs>
+          <w:tab w:val="num" w:pos="4320"/>
+        </w:tabs>
+        <w:ind w:left="4320" w:hanging="360"/>
+      </w:pPr>
+      <w:rPr>
+        <w:rFonts w:ascii="Wingdings" w:hAnsi="Wingdings" w:hint="default"/>
+        <w:sz w:val="20"/>
+      </w:rPr>
+    </w:lvl>
+    <w:lvl w:ilvl="6" w:tentative="1">
+      <w:start w:val="1"/>
+      <w:numFmt w:val="bullet"/>
+      <w:lvlText w:val=""/>
+      <w:lvlJc w:val="left"/>
+      <w:pPr>
+        <w:tabs>
+          <w:tab w:val="num" w:pos="5040"/>
+        </w:tabs>
+        <w:ind w:left="5040" w:hanging="360"/>
+      </w:pPr>
+      <w:rPr>
+        <w:rFonts w:ascii="Wingdings" w:hAnsi="Wingdings" w:hint="default"/>
+        <w:sz w:val="20"/>
+      </w:rPr>
+    </w:lvl>
+    <w:lvl w:ilvl="7" w:tentative="1">
+      <w:start w:val="1"/>
+      <w:numFmt w:val="bullet"/>
+      <w:lvlText w:val=""/>
+      <w:lvlJc w:val="left"/>
+      <w:pPr>
+        <w:tabs>
+          <w:tab w:val="num" w:pos="5760"/>
+        </w:tabs>
+        <w:ind w:left="5760" w:hanging="360"/>
+      </w:pPr>
+      <w:rPr>
+        <w:rFonts w:ascii="Wingdings" w:hAnsi="Wingdings" w:hint="default"/>
+        <w:sz w:val="20"/>
+      </w:rPr>
+    </w:lvl>
+    <w:lvl w:ilvl="8" w:tentative="1">
+      <w:start w:val="1"/>
+      <w:numFmt w:val="bullet"/>
+      <w:lvlText w:val=""/>
+      <w:lvlJc w:val="left"/>
+      <w:pPr>
+        <w:tabs>
+          <w:tab w:val="num" w:pos="6480"/>
+        </w:tabs>
+        <w:ind w:left="6480" w:hanging="360"/>
+      </w:pPr>
+      <w:rPr>
+        <w:rFonts w:ascii="Wingdings" w:hAnsi="Wingdings" w:hint="default"/>
+        <w:sz w:val="20"/>
+      </w:rPr>
+    </w:lvl>
+  </w:abstractNum>
+  <w:abstractNum w:abstractNumId="1" w15:restartNumberingAfterBreak="0">
     <w:nsid w:val="62616DCB"/>
     <w:multiLevelType w:val="multilevel"/>
     <w:tmpl w:val="8556A12E"/>
@@ -706,7 +1844,7 @@
         <w:sz w:val="20"/>
       </w:rPr>
     </w:lvl>
-    <w:lvl w:ilvl="4" w:tentative="1">
+    <w:lvl w:ilvl="4">
       <w:start w:val="1"/>
       <w:numFmt w:val="bullet"/>
       <w:lvlText w:val=""/>
@@ -788,6 +1926,9 @@
     </w:lvl>
   </w:abstractNum>
   <w:num w:numId="1" w16cid:durableId="120073143">
+    <w:abstractNumId w:val="1"/>
+  </w:num>
+  <w:num w:numId="2" w16cid:durableId="69691896">
     <w:abstractNumId w:val="0"/>
   </w:num>
 </w:numbering>
@@ -1772,6 +2913,19 @@
       </w:tblBorders>
     </w:tblPr>
   </w:style>
+  <w:style w:type="paragraph" w:customStyle="1" w:styleId="ql-indent-1">
+    <w:name w:val="ql-indent-1"/>
+    <w:basedOn w:val="Normal"/>
+    <w:rsid w:val="00F84930"/>
+    <w:pPr>
+      <w:spacing w:before="100" w:beforeAutospacing="1" w:after="100" w:afterAutospacing="1" w:line="240" w:lineRule="auto"/>
+    </w:pPr>
+    <w:rPr>
+      <w:rFonts w:ascii="Times New Roman" w:eastAsia="Times New Roman" w:hAnsi="Times New Roman" w:cs="Times New Roman"/>
+      <w:kern w:val="0"/>
+      <w14:ligatures w14:val="none"/>
+    </w:rPr>
+  </w:style>
 </w:styles>
 </file>
 

</xml_diff>